<commit_message>
Update clients/region/analitika_REGION.docx — unique company content
</commit_message>
<xml_diff>
--- a/clients/region/analitika_REGION.docx
+++ b/clients/region/analitika_REGION.docx
@@ -2,37 +2,87 @@
 <file path=word/document.xml><?xml version="1.0" encoding="utf-8"?>
 <w:document xmlns:wpc="http://schemas.microsoft.com/office/word/2010/wordprocessingCanvas" xmlns:mo="http://schemas.microsoft.com/office/mac/office/2008/main" xmlns:mc="http://schemas.openxmlformats.org/markup-compatibility/2006" xmlns:mv="urn:schemas-microsoft-com:mac:vml" xmlns:o="urn:schemas-microsoft-com:office:office" xmlns:r="http://schemas.openxmlformats.org/officeDocument/2006/relationships" xmlns:m="http://schemas.openxmlformats.org/officeDocument/2006/math" xmlns:v="urn:schemas-microsoft-com:vml" xmlns:wp14="http://schemas.microsoft.com/office/word/2010/wordprocessingDrawing" xmlns:wp="http://schemas.openxmlformats.org/drawingml/2006/wordprocessingDrawing" xmlns:w10="urn:schemas-microsoft-com:office:word" xmlns:w="http://schemas.openxmlformats.org/wordprocessingml/2006/main" xmlns:w14="http://schemas.microsoft.com/office/word/2010/wordml" xmlns:wpg="http://schemas.microsoft.com/office/word/2010/wordprocessingGroup" xmlns:wpi="http://schemas.microsoft.com/office/word/2010/wordprocessingInk" xmlns:wne="http://schemas.microsoft.com/office/word/2006/wordml" xmlns:wps="http://schemas.microsoft.com/office/word/2010/wordprocessingShape" mc:Ignorable="w14 wp14">
   <w:body>
+    <w:p>
+      <w:pPr>
+        <w:jc w:val="center"/>
+      </w:pPr>
+      <w:r>
+        <w:rPr>
+          <w:rFonts w:ascii="Arial" w:hAnsi="Arial"/>
+          <w:b/>
+          <w:sz w:val="18"/>
+        </w:rPr>
+        <w:t>КОНСАЛТИНГОВАЯ КОМПАНИЯ</w:t>
+      </w:r>
+    </w:p>
+    <w:p>
+      <w:pPr>
+        <w:jc w:val="center"/>
+      </w:pPr>
+      <w:r>
+        <w:rPr>
+          <w:rFonts w:ascii="Arial" w:hAnsi="Arial"/>
+          <w:sz w:val="18"/>
+        </w:rPr>
+        <w:t>ANDROMEDA CONSULT</w:t>
+      </w:r>
+    </w:p>
+    <w:p>
+      <w:pPr>
+        <w:jc w:val="center"/>
+      </w:pPr>
+      <w:r>
+        <w:rPr>
+          <w:rFonts w:ascii="Arial" w:hAnsi="Arial"/>
+          <w:sz w:val="18"/>
+        </w:rPr>
+        <w:t>ИНН 7702464831  |  ОГРН 1197746181038  |  КПП 770201001</w:t>
+      </w:r>
+    </w:p>
+    <w:p>
+      <w:pPr>
+        <w:jc w:val="center"/>
+      </w:pPr>
+      <w:r>
+        <w:rPr>
+          <w:rFonts w:ascii="Arial" w:hAnsi="Arial"/>
+          <w:sz w:val="18"/>
+        </w:rPr>
+        <w:t>info@andromedaconsult.ru  |  andromedaconsult.ru  |  @andromedaconsult</w:t>
+      </w:r>
+    </w:p>
+    <w:p>
+      <w:pPr>
+        <w:jc w:val="center"/>
+      </w:pPr>
+      <w:r>
+        <w:rPr>
+          <w:color w:val="B4B4B4"/>
+          <w:sz w:val="16"/>
+        </w:rPr>
+        <w:t>=======================================================</w:t>
+      </w:r>
+    </w:p>
     <w:tbl>
       <w:tblPr>
-        <w:tblBorders>
-          <w:top w:val="single" w:sz="6" w:space="0" w:color="1e293b"/>
-          <w:bottom w:val="single" w:sz="6" w:space="0" w:color="1e293b"/>
-          <w:left w:val="single" w:sz="6" w:space="0" w:color="1e293b"/>
-          <w:right w:val="single" w:sz="6" w:space="0" w:color="1e293b"/>
-        </w:tblBorders>
+        <w:tblW w:type="auto" w:w="0"/>
+        <w:tblLook w:firstColumn="1" w:firstRow="1" w:lastColumn="0" w:lastRow="0" w:noHBand="0" w:noVBand="1" w:val="04A0"/>
       </w:tblPr>
       <w:tblGrid>
-        <w:gridCol w:w="9972"/>
+        <w:gridCol w:w="9406"/>
       </w:tblGrid>
       <w:tr>
         <w:tc>
           <w:tcPr>
-            <w:tcW w:type="dxa" w:w="9071"/>
-            <w:shd w:fill="1e293b" w:val="clear"/>
+            <w:tcW w:type="dxa" w:w="9406"/>
           </w:tcPr>
           <w:p>
-            <w:pPr>
-              <w:spacing w:before="140" w:after="140"/>
-            </w:pPr>
-            <w:r/>
             <w:r>
               <w:rPr>
-                <w:rFonts w:ascii="Calibri" w:hAnsi="Calibri"/>
                 <w:b/>
-                <w:color w:val="FFFFFF"/>
-                <w:sz w:val="20"/>
+                <w:sz w:val="26"/>
               </w:rPr>
-              <w:t>ООО «РЕГИОН» · Предварительный анализ для Сколково · 09.07.2026</w:t>
+              <w:t>ООО «РЕГИОН» · Предварительный анализ для Сколково</w:t>
             </w:r>
           </w:p>
         </w:tc>
@@ -40,7 +90,7 @@
       <w:tr>
         <w:tc>
           <w:tcPr>
-            <w:tcW w:type="dxa" w:w="9071"/>
+            <w:tcW w:type="dxa" w:w="9406"/>
           </w:tcPr>
           <w:p>
             <w:r/>
@@ -49,105 +99,41 @@
       </w:tr>
     </w:tbl>
     <w:p>
-      <w:pPr>
-        <w:spacing w:after="40" w:before="0" w:line="240" w:lineRule="auto"/>
-      </w:pPr>
       <w:r>
         <w:rPr>
-          <w:rFonts w:ascii="Calibri" w:hAnsi="Calibri"/>
-          <w:b/>
-          <w:color w:val="1E293B"/>
+          <w:color w:val="646464"/>
           <w:sz w:val="18"/>
         </w:rPr>
-        <w:t>КОНСАЛТИНГОВАЯ КОМПАНИЯ</w:t>
+        <w:t>09 июля 2026 г.</w:t>
       </w:r>
     </w:p>
     <w:p>
-      <w:pPr>
-        <w:spacing w:after="40" w:before="0" w:line="240" w:lineRule="auto"/>
-      </w:pPr>
       <w:r>
         <w:rPr>
-          <w:rFonts w:ascii="Calibri" w:hAnsi="Calibri"/>
-          <w:b/>
-          <w:color w:val="1E293B"/>
-          <w:sz w:val="32"/>
-        </w:rPr>
-        <w:t>ANDROMEDA CONSULT</w:t>
-      </w:r>
-    </w:p>
-    <w:p>
-      <w:pPr>
-        <w:spacing w:after="40" w:before="0" w:line="240" w:lineRule="auto"/>
-      </w:pPr>
-      <w:r>
-        <w:rPr>
-          <w:rFonts w:ascii="Calibri" w:hAnsi="Calibri"/>
-          <w:color w:val="64748B"/>
+          <w:color w:val="B4B4B4"/>
           <w:sz w:val="16"/>
         </w:rPr>
-        <w:t>ИНН 7702464831  |  ОГРН 1197746181038  |  КПП 770201001</w:t>
+        <w:t>———————————————————————————————————————————————————————</w:t>
       </w:r>
-    </w:p>
-    <w:p>
-      <w:pPr>
-        <w:spacing w:after="80" w:before="0" w:line="240" w:lineRule="auto"/>
-      </w:pPr>
-      <w:r>
-        <w:rPr>
-          <w:rFonts w:ascii="Calibri" w:hAnsi="Calibri"/>
-          <w:color w:val="475569"/>
-          <w:sz w:val="16"/>
-        </w:rPr>
-        <w:t>info@andromedaconsult.ru  |  andromedaconsult.ru  |  @andromedaconsult</w:t>
-      </w:r>
-    </w:p>
-    <w:p>
-      <w:pPr>
-        <w:spacing w:before="120" w:after="240"/>
-      </w:pPr>
-      <w:r>
-        <w:rPr>
-          <w:sz w:val="12"/>
-          <w:color w:val="cbd5e1"/>
-        </w:rPr>
-        <w:t>────────────────────────────────────────────────────────────────────────</w:t>
-      </w:r>
-    </w:p>
-    <w:p>
-      <w:pPr>
-        <w:spacing w:before="60" w:after="0"/>
-      </w:pPr>
     </w:p>
     <w:tbl>
       <w:tblPr>
-        <w:tblBorders>
-          <w:top w:val="single" w:sz="6" w:space="0" w:color="e5e7eb"/>
-          <w:bottom w:val="single" w:sz="6" w:space="0" w:color="e5e7eb"/>
-          <w:left w:val="single" w:sz="6" w:space="0" w:color="e5e7eb"/>
-          <w:right w:val="single" w:sz="6" w:space="0" w:color="e5e7eb"/>
-        </w:tblBorders>
+        <w:tblW w:type="auto" w:w="0"/>
+        <w:tblLook w:firstColumn="1" w:firstRow="1" w:lastColumn="0" w:lastRow="0" w:noHBand="0" w:noVBand="1" w:val="04A0"/>
       </w:tblPr>
       <w:tblGrid>
-        <w:gridCol w:w="9972"/>
+        <w:gridCol w:w="9406"/>
       </w:tblGrid>
       <w:tr>
         <w:tc>
           <w:tcPr>
-            <w:tcW w:type="dxa" w:w="9071"/>
-            <w:shd w:fill="f3f4f6" w:val="clear"/>
+            <w:tcW w:type="dxa" w:w="9406"/>
           </w:tcPr>
           <w:p>
-            <w:pPr>
-              <w:spacing w:before="140" w:after="140"/>
-            </w:pPr>
-            <w:r/>
             <w:r>
               <w:rPr>
-                <w:rFonts w:ascii="Calibri" w:hAnsi="Calibri"/>
                 <w:b/>
-                <w:color w:val="111827"/>
-                <w:sz w:val="20"/>
+                <w:sz w:val="22"/>
               </w:rPr>
               <w:t>📋 Основные реквизиты</w:t>
             </w:r>
@@ -157,90 +143,43 @@
       <w:tr>
         <w:tc>
           <w:tcPr>
-            <w:tcW w:type="dxa" w:w="9071"/>
+            <w:tcW w:type="dxa" w:w="9406"/>
           </w:tcPr>
           <w:p>
-            <w:r/>
-          </w:p>
-          <w:p>
-            <w:pPr>
-              <w:spacing w:after="60" w:before="0"/>
-            </w:pPr>
             <w:r>
-              <w:rPr>
-                <w:rFonts w:ascii="Calibri" w:hAnsi="Calibri"/>
-                <w:b/>
-                <w:color w:val="374151"/>
-                <w:sz w:val="19"/>
-              </w:rPr>
-              <w:t>ИНН 2539118775  ·  ОГРН 1112539013410  ·  7 чел.  ·  06.03.2014</w:t>
-            </w:r>
-          </w:p>
-          <w:p>
-            <w:pPr>
-              <w:spacing w:after="60" w:before="0"/>
-            </w:pPr>
-            <w:r>
-              <w:rPr>
-                <w:rFonts w:ascii="Calibri" w:hAnsi="Calibri"/>
-                <w:color w:val="6B7280"/>
-                <w:sz w:val="18"/>
-              </w:rPr>
-              <w:t>📍 Приморский край, г. Владивосток, ул. Фурманова, д. 18, оф. 201</w:t>
-            </w:r>
-          </w:p>
-          <w:p>
-            <w:pPr>
-              <w:spacing w:after="0" w:before="0"/>
-            </w:pPr>
-            <w:r>
-              <w:rPr>
-                <w:rFonts w:ascii="Calibri" w:hAnsi="Calibri"/>
-                <w:color w:val="6B7280"/>
-                <w:sz w:val="18"/>
-              </w:rPr>
-              <w:t>🏭 25.99 — Производство прочих готовых металлических изделий</w:t>
+              <w:br/>
+              <w:t>ИНН 2539118775  ·  ОГРН 1112539013410  ·  7 чел.</w:t>
+              <w:br/>
+              <w:t>690011, г. Владивосток, ул. Енисейская, 23Б, оф. 800</w:t>
+              <w:br/>
+              <w:t>Директор: Кялунзига Алексей Васильевич</w:t>
+              <w:br/>
+              <w:t>ОКВЭД 25.11: Производство строительных металлических конструкций</w:t>
             </w:r>
           </w:p>
         </w:tc>
       </w:tr>
     </w:tbl>
-    <w:p>
-      <w:pPr>
-        <w:spacing w:before="60" w:after="0"/>
-      </w:pPr>
-    </w:p>
     <w:tbl>
       <w:tblPr>
-        <w:tblBorders>
-          <w:top w:val="single" w:sz="6" w:space="0" w:color="e5e7eb"/>
-          <w:bottom w:val="single" w:sz="6" w:space="0" w:color="e5e7eb"/>
-          <w:left w:val="single" w:sz="6" w:space="0" w:color="e5e7eb"/>
-          <w:right w:val="single" w:sz="6" w:space="0" w:color="e5e7eb"/>
-        </w:tblBorders>
+        <w:tblW w:type="auto" w:w="0"/>
+        <w:tblLook w:firstColumn="1" w:firstRow="1" w:lastColumn="0" w:lastRow="0" w:noHBand="0" w:noVBand="1" w:val="04A0"/>
       </w:tblPr>
       <w:tblGrid>
-        <w:gridCol w:w="9972"/>
+        <w:gridCol w:w="9406"/>
       </w:tblGrid>
       <w:tr>
         <w:tc>
           <w:tcPr>
-            <w:tcW w:type="dxa" w:w="9071"/>
-            <w:shd w:fill="f3f4f6" w:val="clear"/>
+            <w:tcW w:type="dxa" w:w="9406"/>
           </w:tcPr>
           <w:p>
-            <w:pPr>
-              <w:spacing w:before="140" w:after="140"/>
-            </w:pPr>
-            <w:r/>
             <w:r>
               <w:rPr>
-                <w:rFonts w:ascii="Calibri" w:hAnsi="Calibri"/>
                 <w:b/>
-                <w:color w:val="111827"/>
-                <w:sz w:val="20"/>
+                <w:sz w:val="22"/>
               </w:rPr>
-              <w:t>1️⃣ Наша выручка по годам</w:t>
+              <w:t>1️⃣ Выручка по годам</w:t>
             </w:r>
           </w:p>
         </w:tc>
@@ -248,156 +187,47 @@
       <w:tr>
         <w:tc>
           <w:tcPr>
-            <w:tcW w:type="dxa" w:w="9071"/>
+            <w:tcW w:type="dxa" w:w="9406"/>
           </w:tcPr>
           <w:p>
-            <w:r/>
-          </w:p>
-          <w:p>
-            <w:pPr>
-              <w:spacing w:after="60" w:before="0"/>
-            </w:pPr>
             <w:r>
-              <w:rPr>
-                <w:rFonts w:ascii="Calibri" w:hAnsi="Calibri"/>
-                <w:b/>
-                <w:color w:val="2563EB"/>
-                <w:sz w:val="18"/>
-              </w:rPr>
-              <w:t>2022    276,1 млн ₽</w:t>
-            </w:r>
-          </w:p>
-          <w:p>
-            <w:pPr>
-              <w:spacing w:after="60" w:before="0"/>
-            </w:pPr>
-            <w:r>
-              <w:rPr>
-                <w:rFonts w:ascii="Calibri" w:hAnsi="Calibri"/>
-                <w:b/>
-                <w:color w:val="A16207"/>
-                <w:sz w:val="18"/>
-              </w:rPr>
-              <w:t>2023  ≈ 400 млн ₽ *</w:t>
-            </w:r>
-          </w:p>
-          <w:p>
-            <w:pPr>
-              <w:spacing w:after="60" w:before="0"/>
-            </w:pPr>
-            <w:r>
-              <w:rPr>
-                <w:rFonts w:ascii="Calibri" w:hAnsi="Calibri"/>
-                <w:b/>
-                <w:color w:val="2563EB"/>
-                <w:sz w:val="18"/>
-              </w:rPr>
-              <w:t>2024    505,9 млн ₽</w:t>
-            </w:r>
-          </w:p>
-          <w:p>
-            <w:pPr>
-              <w:spacing w:after="60" w:before="0"/>
-            </w:pPr>
-            <w:r>
-              <w:rPr>
-                <w:rFonts w:ascii="Calibri" w:hAnsi="Calibri"/>
-                <w:b/>
-                <w:color w:val="2563EB"/>
-                <w:sz w:val="18"/>
-              </w:rPr>
-              <w:t>2025    324,5 млн ₽</w:t>
-            </w:r>
-          </w:p>
-          <w:tbl>
-            <w:tblPr>
-              <w:tblBorders>
-                <w:top w:val="single" w:sz="8" w:space="0" w:color="e5e7eb"/>
-                <w:bottom w:val="single" w:sz="8" w:space="0" w:color="e5e7eb"/>
-                <w:left w:val="single" w:sz="8" w:space="0" w:color="e5e7eb"/>
-                <w:right w:val="single" w:sz="8" w:space="0" w:color="e5e7eb"/>
-              </w:tblBorders>
-            </w:tblPr>
-            <w:tblGrid>
-              <w:gridCol w:w="9071"/>
-            </w:tblGrid>
-            <w:tr>
-              <w:tc>
-                <w:tcPr>
-                  <w:tcW w:type="dxa" w:w="8787"/>
-                  <w:shd w:fill="f9fafb" w:val="clear"/>
-                </w:tcPr>
-                <w:p>
-                  <w:pPr>
-                    <w:spacing w:before="120" w:after="120"/>
-                  </w:pPr>
-                  <w:r/>
-                  <w:r>
-                    <w:rPr>
-                      <w:rFonts w:ascii="Calibri" w:hAnsi="Calibri"/>
-                      <w:b/>
-                      <w:color w:val="1E293B"/>
-                      <w:sz w:val="20"/>
-                    </w:rPr>
-                    <w:t>📊 Суммарно за 2022–2025: ~1 506 млн ₽</w:t>
-                  </w:r>
-                </w:p>
-              </w:tc>
-            </w:tr>
-          </w:tbl>
-          <w:p/>
-          <w:p>
-            <w:pPr>
-              <w:spacing w:after="0" w:before="0"/>
-            </w:pPr>
-            <w:r>
-              <w:rPr>
-                <w:rFonts w:ascii="Calibri" w:hAnsi="Calibri"/>
-                <w:color w:val="9CA3AF"/>
-                <w:sz w:val="16"/>
-              </w:rPr>
-              <w:t>* 2023 — оценка на основе косвенных данных</w:t>
+              <w:t>2022    - млн руб.</w:t>
+              <w:br/>
+              <w:t>2023    - млн руб.</w:t>
+              <w:br/>
+              <w:t>2024    ~412 млн руб.</w:t>
+              <w:br/>
+              <w:t>2025    120 млн руб.</w:t>
+              <w:br/>
+              <w:br/>
+              <w:t>Суммарно: ~532 млн руб.</w:t>
+              <w:br/>
+              <w:t>Прибыль за 2025: 12,9 млн руб.</w:t>
             </w:r>
           </w:p>
         </w:tc>
       </w:tr>
     </w:tbl>
-    <w:p>
-      <w:pPr>
-        <w:spacing w:before="60" w:after="0"/>
-      </w:pPr>
-    </w:p>
     <w:tbl>
       <w:tblPr>
-        <w:tblBorders>
-          <w:top w:val="single" w:sz="6" w:space="0" w:color="e5e7eb"/>
-          <w:bottom w:val="single" w:sz="6" w:space="0" w:color="e5e7eb"/>
-          <w:left w:val="single" w:sz="6" w:space="0" w:color="e5e7eb"/>
-          <w:right w:val="single" w:sz="6" w:space="0" w:color="e5e7eb"/>
-        </w:tblBorders>
+        <w:tblW w:type="auto" w:w="0"/>
+        <w:tblLook w:firstColumn="1" w:firstRow="1" w:lastColumn="0" w:lastRow="0" w:noHBand="0" w:noVBand="1" w:val="04A0"/>
       </w:tblPr>
       <w:tblGrid>
-        <w:gridCol w:w="9972"/>
+        <w:gridCol w:w="9406"/>
       </w:tblGrid>
       <w:tr>
         <w:tc>
           <w:tcPr>
-            <w:tcW w:type="dxa" w:w="9071"/>
-            <w:shd w:fill="f3f4f6" w:val="clear"/>
+            <w:tcW w:type="dxa" w:w="9406"/>
           </w:tcPr>
           <w:p>
-            <w:pPr>
-              <w:spacing w:before="140" w:after="140"/>
-            </w:pPr>
-            <w:r/>
             <w:r>
               <w:rPr>
-                <w:rFonts w:ascii="Calibri" w:hAnsi="Calibri"/>
                 <w:b/>
-                <w:color w:val="111827"/>
-                <w:sz w:val="20"/>
+                <w:sz w:val="22"/>
               </w:rPr>
-              <w:t>2️⃣ Наше производство — что мы предполагаем</w:t>
+              <w:t>2️⃣ Производство</w:t>
             </w:r>
           </w:p>
         </w:tc>
@@ -405,168 +235,38 @@
       <w:tr>
         <w:tc>
           <w:tcPr>
-            <w:tcW w:type="dxa" w:w="9071"/>
+            <w:tcW w:type="dxa" w:w="9406"/>
           </w:tcPr>
           <w:p>
-            <w:r/>
-          </w:p>
-          <w:p>
-            <w:pPr>
-              <w:spacing w:after="60" w:before="0"/>
-            </w:pPr>
             <w:r>
-              <w:rPr>
-                <w:rFonts w:ascii="Calibri" w:hAnsi="Calibri"/>
-                <w:color w:val="374151"/>
-                <w:sz w:val="19"/>
-              </w:rPr>
-              <w:t>Мы находимся в промышленной зоне металлургического завода «Амурсталь» — это даёт нам прямой доступ к металлопрокату. В нашей команде 94 человека, среди которых инженеры-конструкторы, технологи, специалисты ОТК и инструментальщики — полноценный производственный цикл с собственным конструкторским отделом.</w:t>
+              <w:br/>
+              <w:t>ООО «РЕГИОН» занимается производство строительных металлических конструкций во Владивостоке. Компания работает на рынке более 12 лет и изготавливает металлоконструкции для строительной отрасли. Производственные мощности расположены в г. Владивосток.</w:t>
+              <w:br/>
+              <w:br/>
+              <w:t>Штат составляет 7 человек.</w:t>
             </w:r>
           </w:p>
-          <w:p>
-            <w:pPr>
-              <w:spacing w:after="60" w:before="0"/>
-            </w:pPr>
-            <w:r>
-              <w:rPr>
-                <w:rFonts w:ascii="Calibri" w:hAnsi="Calibri"/>
-                <w:b/>
-                <w:color w:val="374151"/>
-                <w:sz w:val="19"/>
-              </w:rPr>
-              <w:t>Предполагаем, что наша продукция может быть связана с:</w:t>
-            </w:r>
-          </w:p>
-          <w:p>
-            <w:pPr>
-              <w:pStyle w:val="ListNumber"/>
-              <w:spacing w:after="20" w:before="0"/>
-            </w:pPr>
-            <w:r>
-              <w:rPr>
-                <w:rFonts w:ascii="Calibri" w:hAnsi="Calibri"/>
-                <w:color w:val="374151"/>
-                <w:sz w:val="20"/>
-              </w:rPr>
-              <w:t>Износостойкими покрытиями для промышленных деталей</w:t>
-            </w:r>
-          </w:p>
-          <w:p>
-            <w:pPr>
-              <w:pStyle w:val="ListNumber"/>
-              <w:spacing w:after="20" w:before="0"/>
-            </w:pPr>
-            <w:r>
-              <w:rPr>
-                <w:rFonts w:ascii="Calibri" w:hAnsi="Calibri"/>
-                <w:color w:val="374151"/>
-                <w:sz w:val="20"/>
-              </w:rPr>
-              <w:t>Специализированным инструментом и оснасткой</w:t>
-            </w:r>
-          </w:p>
-          <w:p>
-            <w:pPr>
-              <w:pStyle w:val="ListNumber"/>
-              <w:spacing w:after="20" w:before="0"/>
-            </w:pPr>
-            <w:r>
-              <w:rPr>
-                <w:rFonts w:ascii="Calibri" w:hAnsi="Calibri"/>
-                <w:color w:val="374151"/>
-                <w:sz w:val="20"/>
-              </w:rPr>
-              <w:t>Пресс-формами и штампами</w:t>
-            </w:r>
-          </w:p>
-          <w:p>
-            <w:pPr>
-              <w:pStyle w:val="ListNumber"/>
-              <w:spacing w:after="20" w:before="0"/>
-            </w:pPr>
-            <w:r>
-              <w:rPr>
-                <w:rFonts w:ascii="Calibri" w:hAnsi="Calibri"/>
-                <w:color w:val="374151"/>
-                <w:sz w:val="20"/>
-              </w:rPr>
-              <w:t>Металлоизделиями для машиностроения и РЖД</w:t>
-            </w:r>
-          </w:p>
-          <w:tbl>
-            <w:tblPr>
-              <w:tblBorders>
-                <w:top w:val="single" w:sz="8" w:space="0" w:color="fde68a"/>
-                <w:bottom w:val="single" w:sz="8" w:space="0" w:color="fde68a"/>
-                <w:left w:val="single" w:sz="8" w:space="0" w:color="fde68a"/>
-                <w:right w:val="single" w:sz="8" w:space="0" w:color="fde68a"/>
-              </w:tblBorders>
-            </w:tblPr>
-            <w:tblGrid>
-              <w:gridCol w:w="9071"/>
-            </w:tblGrid>
-            <w:tr>
-              <w:tc>
-                <w:tcPr>
-                  <w:tcW w:type="dxa" w:w="8787"/>
-                  <w:shd w:fill="fefce8" w:val="clear"/>
-                </w:tcPr>
-                <w:p>
-                  <w:pPr>
-                    <w:spacing w:before="120" w:after="120"/>
-                  </w:pPr>
-                  <w:r/>
-                  <w:r>
-                    <w:rPr>
-                      <w:rFonts w:ascii="Calibri" w:hAnsi="Calibri"/>
-                      <w:b/>
-                      <w:color w:val="A16207"/>
-                      <w:sz w:val="18"/>
-                    </w:rPr>
-                    <w:t>⚠️ Для точного определения продукта-инновации нужно согласовать с вами — что именно мы производим, в чём может заключаться инновация.</w:t>
-                  </w:r>
-                </w:p>
-              </w:tc>
-            </w:tr>
-          </w:tbl>
-          <w:p/>
         </w:tc>
       </w:tr>
     </w:tbl>
-    <w:p>
-      <w:pPr>
-        <w:spacing w:before="60" w:after="0"/>
-      </w:pPr>
-    </w:p>
     <w:tbl>
       <w:tblPr>
-        <w:tblBorders>
-          <w:top w:val="single" w:sz="6" w:space="0" w:color="e5e7eb"/>
-          <w:bottom w:val="single" w:sz="6" w:space="0" w:color="e5e7eb"/>
-          <w:left w:val="single" w:sz="6" w:space="0" w:color="e5e7eb"/>
-          <w:right w:val="single" w:sz="6" w:space="0" w:color="e5e7eb"/>
-        </w:tblBorders>
+        <w:tblW w:type="auto" w:w="0"/>
+        <w:tblLook w:firstColumn="1" w:firstRow="1" w:lastColumn="0" w:lastRow="0" w:noHBand="0" w:noVBand="1" w:val="04A0"/>
       </w:tblPr>
       <w:tblGrid>
-        <w:gridCol w:w="9972"/>
+        <w:gridCol w:w="9406"/>
       </w:tblGrid>
       <w:tr>
         <w:tc>
           <w:tcPr>
-            <w:tcW w:type="dxa" w:w="9071"/>
-            <w:shd w:fill="f3f4f6" w:val="clear"/>
+            <w:tcW w:type="dxa" w:w="9406"/>
           </w:tcPr>
           <w:p>
-            <w:pPr>
-              <w:spacing w:before="140" w:after="140"/>
-            </w:pPr>
-            <w:r/>
             <w:r>
               <w:rPr>
-                <w:rFonts w:ascii="Calibri" w:hAnsi="Calibri"/>
                 <w:b/>
-                <w:color w:val="111827"/>
-                <w:sz w:val="20"/>
+                <w:sz w:val="22"/>
               </w:rPr>
               <w:t>3️⃣ Расчёт налоговой экономии при статусе резидента Сколково</w:t>
             </w:r>
@@ -576,1147 +276,74 @@
       <w:tr>
         <w:tc>
           <w:tcPr>
-            <w:tcW w:type="dxa" w:w="9071"/>
+            <w:tcW w:type="dxa" w:w="9406"/>
           </w:tcPr>
           <w:p>
-            <w:r/>
-          </w:p>
-          <w:p>
-            <w:pPr>
-              <w:spacing w:after="60" w:before="0"/>
-            </w:pPr>
             <w:r>
-              <w:rPr>
-                <w:rFonts w:ascii="Calibri" w:hAnsi="Calibri"/>
-                <w:color w:val="374151"/>
-                <w:sz w:val="19"/>
-              </w:rPr>
               <w:t>Статус резидента Сколково даёт следующие льготы:</w:t>
+              <w:br/>
+              <w:t>• Налог на прибыль — 0% (вместо 20%)</w:t>
+              <w:br/>
+              <w:t>• Страховые взносы — 15% с порога 1,5×МРОТ (вместо 30%)</w:t>
+              <w:br/>
+              <w:t>• Налог на имущество — 0%</w:t>
+              <w:br/>
+              <w:t>• Льготы по НДС и таможенным платежам</w:t>
+              <w:br/>
+              <w:br/>
+              <w:t>Предварительный расчёт экономии для ООО «РЕГИОН»:</w:t>
+              <w:br/>
+              <w:br/>
+              <w:t>❶ Налог на прибыль (0% vs 20%)</w:t>
+              <w:br/>
+              <w:t xml:space="preserve">  Прибыль за 2025: 12,9 млн руб.</w:t>
+              <w:br/>
+              <w:t xml:space="preserve">  Экономия: ~3 млн руб. в год</w:t>
+              <w:br/>
+              <w:br/>
+              <w:t>❷ Страховые взносы (15% вместо 30%)</w:t>
+              <w:br/>
+              <w:t xml:space="preserve">  Экономия за счёт пониженного тарифа на ФОТ свыше 1,5×МРОТ</w:t>
+              <w:br/>
+              <w:br/>
+              <w:t>❸ Налог на имущество — 0%</w:t>
+              <w:br/>
+              <w:t xml:space="preserve">  Зависит от состава основных средств</w:t>
+              <w:br/>
+              <w:br/>
+              <w:t>Прогноз суммарной экономии:</w:t>
+              <w:br/>
+              <w:t>• В год: ~3 млн руб.</w:t>
+              <w:br/>
+              <w:t>• За 4 года: ~12 млн руб.</w:t>
+              <w:br/>
+              <w:t>• За 10 лет: ~30 млн руб.</w:t>
+              <w:br/>
+              <w:br/>
+              <w:t>Окупаемость услуг: 3–6 месяцев</w:t>
             </w:r>
           </w:p>
-          <w:p>
-            <w:pPr>
-              <w:pStyle w:val="ListBullet"/>
-              <w:spacing w:after="20" w:before="0"/>
-            </w:pPr>
-            <w:r>
-              <w:rPr>
-                <w:rFonts w:ascii="Calibri" w:hAnsi="Calibri"/>
-                <w:color w:val="374151"/>
-                <w:sz w:val="20"/>
-              </w:rPr>
-              <w:t>Налог на прибыль — 0% вместо 20%</w:t>
-            </w:r>
-          </w:p>
-          <w:p>
-            <w:pPr>
-              <w:pStyle w:val="ListBullet"/>
-              <w:spacing w:after="20" w:before="0"/>
-            </w:pPr>
-            <w:r>
-              <w:rPr>
-                <w:rFonts w:ascii="Calibri" w:hAnsi="Calibri"/>
-                <w:color w:val="374151"/>
-                <w:sz w:val="20"/>
-              </w:rPr>
-              <w:t>Страховые взносы — 15% вместо 30% (с порогом 1,5× МРОТ)</w:t>
-            </w:r>
-          </w:p>
-          <w:p>
-            <w:pPr>
-              <w:pStyle w:val="ListBullet"/>
-              <w:spacing w:after="20" w:before="0"/>
-            </w:pPr>
-            <w:r>
-              <w:rPr>
-                <w:rFonts w:ascii="Calibri" w:hAnsi="Calibri"/>
-                <w:color w:val="374151"/>
-                <w:sz w:val="20"/>
-              </w:rPr>
-              <w:t>Налог на имущество — 0%</w:t>
-            </w:r>
-          </w:p>
-          <w:p>
-            <w:pPr>
-              <w:pStyle w:val="ListBullet"/>
-              <w:spacing w:after="20" w:before="0"/>
-            </w:pPr>
-            <w:r>
-              <w:rPr>
-                <w:rFonts w:ascii="Calibri" w:hAnsi="Calibri"/>
-                <w:color w:val="374151"/>
-                <w:sz w:val="20"/>
-              </w:rPr>
-              <w:t>НДС — без изменений (сохраняем общий режим)</w:t>
-            </w:r>
-          </w:p>
-          <w:tbl>
-            <w:tblPr>
-              <w:tblW w:type="auto" w:w="0"/>
-              <w:jc w:val="center"/>
-              <w:tblLook w:firstColumn="1" w:firstRow="1" w:lastColumn="0" w:lastRow="0" w:noHBand="0" w:noVBand="1" w:val="04A0"/>
-              <w:tblBorders>
-                <w:top w:val="single" w:sz="4" w:space="0" w:color="d1d5db"/>
-                <w:bottom w:val="single" w:sz="4" w:space="0" w:color="d1d5db"/>
-                <w:left w:val="single" w:sz="4" w:space="0" w:color="d1d5db"/>
-                <w:right w:val="single" w:sz="4" w:space="0" w:color="d1d5db"/>
-                <w:insideH w:val="single" w:sz="4" w:space="0" w:color="d1d5db"/>
-                <w:insideV w:val="single" w:sz="4" w:space="0" w:color="d1d5db"/>
-              </w:tblBorders>
-            </w:tblPr>
-            <w:tblGrid>
-              <w:gridCol w:w="1512"/>
-              <w:gridCol w:w="1512"/>
-              <w:gridCol w:w="1512"/>
-              <w:gridCol w:w="1512"/>
-              <w:gridCol w:w="1512"/>
-              <w:gridCol w:w="1512"/>
-            </w:tblGrid>
-            <w:tr>
-              <w:tc>
-                <w:tcPr>
-                  <w:tcW w:type="dxa" w:w="2381"/>
-                  <w:shd w:fill="f9fafb" w:val="clear"/>
-                </w:tcPr>
-                <w:p>
-                  <w:pPr>
-                    <w:spacing w:before="60" w:after="60"/>
-                  </w:pPr>
-                  <w:r/>
-                  <w:r>
-                    <w:rPr>
-                      <w:rFonts w:ascii="Calibri" w:hAnsi="Calibri"/>
-                      <w:b/>
-                      <w:color w:val="374151"/>
-                      <w:sz w:val="17"/>
-                    </w:rPr>
-                    <w:t>Показатель</w:t>
-                  </w:r>
-                </w:p>
-              </w:tc>
-              <w:tc>
-                <w:tcPr>
-                  <w:tcW w:type="dxa" w:w="1020"/>
-                  <w:shd w:fill="f9fafb" w:val="clear"/>
-                </w:tcPr>
-                <w:p>
-                  <w:pPr>
-                    <w:spacing w:before="60" w:after="60"/>
-                  </w:pPr>
-                  <w:r/>
-                  <w:r>
-                    <w:rPr>
-                      <w:rFonts w:ascii="Calibri" w:hAnsi="Calibri"/>
-                      <w:b/>
-                      <w:color w:val="374151"/>
-                      <w:sz w:val="17"/>
-                    </w:rPr>
-                    <w:t>2022</w:t>
-                  </w:r>
-                </w:p>
-              </w:tc>
-              <w:tc>
-                <w:tcPr>
-                  <w:tcW w:type="dxa" w:w="1020"/>
-                  <w:shd w:fill="f9fafb" w:val="clear"/>
-                </w:tcPr>
-                <w:p>
-                  <w:pPr>
-                    <w:spacing w:before="60" w:after="60"/>
-                  </w:pPr>
-                  <w:r/>
-                  <w:r>
-                    <w:rPr>
-                      <w:rFonts w:ascii="Calibri" w:hAnsi="Calibri"/>
-                      <w:b/>
-                      <w:color w:val="374151"/>
-                      <w:sz w:val="17"/>
-                    </w:rPr>
-                    <w:t>2023 *</w:t>
-                  </w:r>
-                </w:p>
-              </w:tc>
-              <w:tc>
-                <w:tcPr>
-                  <w:tcW w:type="dxa" w:w="1020"/>
-                  <w:shd w:fill="f9fafb" w:val="clear"/>
-                </w:tcPr>
-                <w:p>
-                  <w:pPr>
-                    <w:spacing w:before="60" w:after="60"/>
-                  </w:pPr>
-                  <w:r/>
-                  <w:r>
-                    <w:rPr>
-                      <w:rFonts w:ascii="Calibri" w:hAnsi="Calibri"/>
-                      <w:b/>
-                      <w:color w:val="374151"/>
-                      <w:sz w:val="17"/>
-                    </w:rPr>
-                    <w:t>2024</w:t>
-                  </w:r>
-                </w:p>
-              </w:tc>
-              <w:tc>
-                <w:tcPr>
-                  <w:tcW w:type="dxa" w:w="1020"/>
-                  <w:shd w:fill="f9fafb" w:val="clear"/>
-                </w:tcPr>
-                <w:p>
-                  <w:pPr>
-                    <w:spacing w:before="60" w:after="60"/>
-                  </w:pPr>
-                  <w:r/>
-                  <w:r>
-                    <w:rPr>
-                      <w:rFonts w:ascii="Calibri" w:hAnsi="Calibri"/>
-                      <w:b/>
-                      <w:color w:val="374151"/>
-                      <w:sz w:val="17"/>
-                    </w:rPr>
-                    <w:t>2025</w:t>
-                  </w:r>
-                </w:p>
-              </w:tc>
-              <w:tc>
-                <w:tcPr>
-                  <w:tcW w:type="dxa" w:w="1417"/>
-                  <w:shd w:fill="f9fafb" w:val="clear"/>
-                </w:tcPr>
-                <w:p>
-                  <w:pPr>
-                    <w:spacing w:before="60" w:after="60"/>
-                  </w:pPr>
-                  <w:r/>
-                  <w:r>
-                    <w:rPr>
-                      <w:rFonts w:ascii="Calibri" w:hAnsi="Calibri"/>
-                      <w:b/>
-                      <w:color w:val="374151"/>
-                      <w:sz w:val="17"/>
-                    </w:rPr>
-                    <w:t>За 4 года</w:t>
-                  </w:r>
-                </w:p>
-              </w:tc>
-            </w:tr>
-            <w:tr>
-              <w:tc>
-                <w:tcPr>
-                  <w:tcW w:type="dxa" w:w="2381"/>
-                </w:tcPr>
-                <w:p>
-                  <w:pPr>
-                    <w:spacing w:before="60" w:after="60"/>
-                  </w:pPr>
-                  <w:r/>
-                  <w:r>
-                    <w:rPr>
-                      <w:rFonts w:ascii="Calibri" w:hAnsi="Calibri"/>
-                      <w:b/>
-                      <w:color w:val="374151"/>
-                      <w:sz w:val="17"/>
-                    </w:rPr>
-                    <w:t>Выручка</w:t>
-                  </w:r>
-                </w:p>
-              </w:tc>
-              <w:tc>
-                <w:tcPr>
-                  <w:tcW w:type="dxa" w:w="1020"/>
-                </w:tcPr>
-                <w:p>
-                  <w:pPr>
-                    <w:spacing w:before="60" w:after="60"/>
-                    <w:jc w:val="right"/>
-                  </w:pPr>
-                  <w:r/>
-                  <w:r>
-                    <w:rPr>
-                      <w:rFonts w:ascii="Calibri" w:hAnsi="Calibri"/>
-                      <w:color w:val="374151"/>
-                      <w:sz w:val="17"/>
-                    </w:rPr>
-                    <w:t>276,1 млн</w:t>
-                  </w:r>
-                </w:p>
-              </w:tc>
-              <w:tc>
-                <w:tcPr>
-                  <w:tcW w:type="dxa" w:w="1020"/>
-                </w:tcPr>
-                <w:p>
-                  <w:pPr>
-                    <w:spacing w:before="60" w:after="60"/>
-                    <w:jc w:val="right"/>
-                  </w:pPr>
-                  <w:r/>
-                  <w:r>
-                    <w:rPr>
-                      <w:rFonts w:ascii="Calibri" w:hAnsi="Calibri"/>
-                      <w:color w:val="374151"/>
-                      <w:sz w:val="17"/>
-                    </w:rPr>
-                    <w:t>~400 млн</w:t>
-                  </w:r>
-                </w:p>
-              </w:tc>
-              <w:tc>
-                <w:tcPr>
-                  <w:tcW w:type="dxa" w:w="1020"/>
-                </w:tcPr>
-                <w:p>
-                  <w:pPr>
-                    <w:spacing w:before="60" w:after="60"/>
-                    <w:jc w:val="right"/>
-                  </w:pPr>
-                  <w:r/>
-                  <w:r>
-                    <w:rPr>
-                      <w:rFonts w:ascii="Calibri" w:hAnsi="Calibri"/>
-                      <w:color w:val="374151"/>
-                      <w:sz w:val="17"/>
-                    </w:rPr>
-                    <w:t>505,9 млн</w:t>
-                  </w:r>
-                </w:p>
-              </w:tc>
-              <w:tc>
-                <w:tcPr>
-                  <w:tcW w:type="dxa" w:w="1020"/>
-                </w:tcPr>
-                <w:p>
-                  <w:pPr>
-                    <w:spacing w:before="60" w:after="60"/>
-                    <w:jc w:val="right"/>
-                  </w:pPr>
-                  <w:r/>
-                  <w:r>
-                    <w:rPr>
-                      <w:rFonts w:ascii="Calibri" w:hAnsi="Calibri"/>
-                      <w:color w:val="374151"/>
-                      <w:sz w:val="17"/>
-                    </w:rPr>
-                    <w:t>324,5 млн</w:t>
-                  </w:r>
-                </w:p>
-              </w:tc>
-              <w:tc>
-                <w:tcPr>
-                  <w:tcW w:type="dxa" w:w="1417"/>
-                </w:tcPr>
-                <w:p>
-                  <w:pPr>
-                    <w:spacing w:before="60" w:after="60"/>
-                    <w:jc w:val="right"/>
-                  </w:pPr>
-                  <w:r/>
-                  <w:r>
-                    <w:rPr>
-                      <w:rFonts w:ascii="Calibri" w:hAnsi="Calibri"/>
-                      <w:b/>
-                      <w:color w:val="374151"/>
-                      <w:sz w:val="17"/>
-                    </w:rPr>
-                    <w:t>~1 506 млн</w:t>
-                  </w:r>
-                </w:p>
-              </w:tc>
-            </w:tr>
-            <w:tr>
-              <w:tc>
-                <w:tcPr>
-                  <w:tcW w:type="dxa" w:w="2381"/>
-                  <w:shd w:fill="f9fafb" w:val="clear"/>
-                </w:tcPr>
-                <w:p>
-                  <w:pPr>
-                    <w:spacing w:before="60" w:after="60"/>
-                  </w:pPr>
-                  <w:r/>
-                  <w:r>
-                    <w:rPr>
-                      <w:rFonts w:ascii="Calibri" w:hAnsi="Calibri"/>
-                      <w:b/>
-                      <w:color w:val="374151"/>
-                      <w:sz w:val="17"/>
-                    </w:rPr>
-                    <w:t>Прибыль до налогообложения</w:t>
-                  </w:r>
-                </w:p>
-              </w:tc>
-              <w:tc>
-                <w:tcPr>
-                  <w:tcW w:type="dxa" w:w="1020"/>
-                  <w:shd w:fill="f9fafb" w:val="clear"/>
-                </w:tcPr>
-                <w:p>
-                  <w:pPr>
-                    <w:spacing w:before="60" w:after="60"/>
-                    <w:jc w:val="right"/>
-                  </w:pPr>
-                  <w:r/>
-                  <w:r>
-                    <w:rPr>
-                      <w:rFonts w:ascii="Calibri" w:hAnsi="Calibri"/>
-                      <w:color w:val="374151"/>
-                      <w:sz w:val="17"/>
-                    </w:rPr>
-                    <w:t>~75 млн</w:t>
-                  </w:r>
-                </w:p>
-              </w:tc>
-              <w:tc>
-                <w:tcPr>
-                  <w:tcW w:type="dxa" w:w="1020"/>
-                  <w:shd w:fill="f9fafb" w:val="clear"/>
-                </w:tcPr>
-                <w:p>
-                  <w:pPr>
-                    <w:spacing w:before="60" w:after="60"/>
-                    <w:jc w:val="right"/>
-                  </w:pPr>
-                  <w:r/>
-                  <w:r>
-                    <w:rPr>
-                      <w:rFonts w:ascii="Calibri" w:hAnsi="Calibri"/>
-                      <w:color w:val="374151"/>
-                      <w:sz w:val="17"/>
-                    </w:rPr>
-                    <w:t>~141 млн</w:t>
-                  </w:r>
-                </w:p>
-              </w:tc>
-              <w:tc>
-                <w:tcPr>
-                  <w:tcW w:type="dxa" w:w="1020"/>
-                  <w:shd w:fill="f9fafb" w:val="clear"/>
-                </w:tcPr>
-                <w:p>
-                  <w:pPr>
-                    <w:spacing w:before="60" w:after="60"/>
-                    <w:jc w:val="right"/>
-                  </w:pPr>
-                  <w:r/>
-                  <w:r>
-                    <w:rPr>
-                      <w:rFonts w:ascii="Calibri" w:hAnsi="Calibri"/>
-                      <w:color w:val="374151"/>
-                      <w:sz w:val="17"/>
-                    </w:rPr>
-                    <w:t>91,6 млн</w:t>
-                  </w:r>
-                </w:p>
-              </w:tc>
-              <w:tc>
-                <w:tcPr>
-                  <w:tcW w:type="dxa" w:w="1020"/>
-                  <w:shd w:fill="f9fafb" w:val="clear"/>
-                </w:tcPr>
-                <w:p>
-                  <w:pPr>
-                    <w:spacing w:before="60" w:after="60"/>
-                    <w:jc w:val="right"/>
-                  </w:pPr>
-                  <w:r/>
-                  <w:r>
-                    <w:rPr>
-                      <w:rFonts w:ascii="Calibri" w:hAnsi="Calibri"/>
-                      <w:color w:val="DC2626"/>
-                      <w:sz w:val="17"/>
-                    </w:rPr>
-                    <w:t>−29,2 млн</w:t>
-                  </w:r>
-                </w:p>
-              </w:tc>
-              <w:tc>
-                <w:tcPr>
-                  <w:tcW w:type="dxa" w:w="1417"/>
-                  <w:shd w:fill="f9fafb" w:val="clear"/>
-                </w:tcPr>
-                <w:p>
-                  <w:pPr>
-                    <w:spacing w:before="60" w:after="60"/>
-                    <w:jc w:val="right"/>
-                  </w:pPr>
-                  <w:r/>
-                  <w:r>
-                    <w:rPr>
-                      <w:rFonts w:ascii="Calibri" w:hAnsi="Calibri"/>
-                      <w:b/>
-                      <w:color w:val="374151"/>
-                      <w:sz w:val="17"/>
-                    </w:rPr>
-                    <w:t>~278 млн</w:t>
-                  </w:r>
-                </w:p>
-              </w:tc>
-            </w:tr>
-            <w:tr>
-              <w:tc>
-                <w:tcPr>
-                  <w:tcW w:type="dxa" w:w="2381"/>
-                </w:tcPr>
-                <w:p>
-                  <w:pPr>
-                    <w:spacing w:before="60" w:after="60"/>
-                  </w:pPr>
-                  <w:r/>
-                  <w:r>
-                    <w:rPr>
-                      <w:rFonts w:ascii="Calibri" w:hAnsi="Calibri"/>
-                      <w:color w:val="2563EB"/>
-                      <w:sz w:val="17"/>
-                    </w:rPr>
-                    <w:t>Экономия: налог на прибыль (0%)</w:t>
-                  </w:r>
-                </w:p>
-              </w:tc>
-              <w:tc>
-                <w:tcPr>
-                  <w:tcW w:type="dxa" w:w="1020"/>
-                  <w:shd w:fill="eff6ff" w:val="clear"/>
-                </w:tcPr>
-                <w:p>
-                  <w:pPr>
-                    <w:spacing w:before="60" w:after="60"/>
-                    <w:jc w:val="right"/>
-                  </w:pPr>
-                  <w:r/>
-                  <w:r>
-                    <w:rPr>
-                      <w:rFonts w:ascii="Calibri" w:hAnsi="Calibri"/>
-                      <w:color w:val="2563EB"/>
-                      <w:sz w:val="17"/>
-                    </w:rPr>
-                    <w:t>~15 млн</w:t>
-                  </w:r>
-                </w:p>
-              </w:tc>
-              <w:tc>
-                <w:tcPr>
-                  <w:tcW w:type="dxa" w:w="1020"/>
-                  <w:shd w:fill="eff6ff" w:val="clear"/>
-                </w:tcPr>
-                <w:p>
-                  <w:pPr>
-                    <w:spacing w:before="60" w:after="60"/>
-                    <w:jc w:val="right"/>
-                  </w:pPr>
-                  <w:r/>
-                  <w:r>
-                    <w:rPr>
-                      <w:rFonts w:ascii="Calibri" w:hAnsi="Calibri"/>
-                      <w:color w:val="2563EB"/>
-                      <w:sz w:val="17"/>
-                    </w:rPr>
-                    <w:t>~28 млн</w:t>
-                  </w:r>
-                </w:p>
-              </w:tc>
-              <w:tc>
-                <w:tcPr>
-                  <w:tcW w:type="dxa" w:w="1020"/>
-                  <w:shd w:fill="eff6ff" w:val="clear"/>
-                </w:tcPr>
-                <w:p>
-                  <w:pPr>
-                    <w:spacing w:before="60" w:after="60"/>
-                    <w:jc w:val="right"/>
-                  </w:pPr>
-                  <w:r/>
-                  <w:r>
-                    <w:rPr>
-                      <w:rFonts w:ascii="Calibri" w:hAnsi="Calibri"/>
-                      <w:color w:val="2563EB"/>
-                      <w:sz w:val="17"/>
-                    </w:rPr>
-                    <w:t>~18,3 млн</w:t>
-                  </w:r>
-                </w:p>
-              </w:tc>
-              <w:tc>
-                <w:tcPr>
-                  <w:tcW w:type="dxa" w:w="1020"/>
-                  <w:shd w:fill="eff6ff" w:val="clear"/>
-                </w:tcPr>
-                <w:p>
-                  <w:pPr>
-                    <w:spacing w:before="60" w:after="60"/>
-                    <w:jc w:val="right"/>
-                  </w:pPr>
-                  <w:r/>
-                  <w:r>
-                    <w:rPr>
-                      <w:rFonts w:ascii="Calibri" w:hAnsi="Calibri"/>
-                      <w:color w:val="9CA3AF"/>
-                      <w:sz w:val="17"/>
-                    </w:rPr>
-                    <w:t>0</w:t>
-                  </w:r>
-                </w:p>
-              </w:tc>
-              <w:tc>
-                <w:tcPr>
-                  <w:tcW w:type="dxa" w:w="1417"/>
-                  <w:shd w:fill="eff6ff" w:val="clear"/>
-                </w:tcPr>
-                <w:p>
-                  <w:pPr>
-                    <w:spacing w:before="60" w:after="60"/>
-                    <w:jc w:val="right"/>
-                  </w:pPr>
-                  <w:r/>
-                  <w:r>
-                    <w:rPr>
-                      <w:rFonts w:ascii="Calibri" w:hAnsi="Calibri"/>
-                      <w:b/>
-                      <w:color w:val="2563EB"/>
-                      <w:sz w:val="17"/>
-                    </w:rPr>
-                    <w:t>~61,3 млн</w:t>
-                  </w:r>
-                </w:p>
-              </w:tc>
-            </w:tr>
-            <w:tr>
-              <w:tc>
-                <w:tcPr>
-                  <w:tcW w:type="dxa" w:w="2381"/>
-                  <w:shd w:fill="f9fafb" w:val="clear"/>
-                </w:tcPr>
-                <w:p>
-                  <w:pPr>
-                    <w:spacing w:before="60" w:after="60"/>
-                  </w:pPr>
-                  <w:r/>
-                  <w:r>
-                    <w:rPr>
-                      <w:rFonts w:ascii="Calibri" w:hAnsi="Calibri"/>
-                      <w:b/>
-                      <w:color w:val="374151"/>
-                      <w:sz w:val="17"/>
-                    </w:rPr>
-                    <w:t>ФОТ (оценка)</w:t>
-                  </w:r>
-                </w:p>
-              </w:tc>
-              <w:tc>
-                <w:tcPr>
-                  <w:tcW w:type="dxa" w:w="1020"/>
-                  <w:shd w:fill="f9fafb" w:val="clear"/>
-                </w:tcPr>
-                <w:p>
-                  <w:pPr>
-                    <w:spacing w:before="60" w:after="60"/>
-                    <w:jc w:val="right"/>
-                  </w:pPr>
-                  <w:r/>
-                  <w:r>
-                    <w:rPr>
-                      <w:rFonts w:ascii="Calibri" w:hAnsi="Calibri"/>
-                      <w:color w:val="374151"/>
-                      <w:sz w:val="17"/>
-                    </w:rPr>
-                    <w:t>~80 млн</w:t>
-                  </w:r>
-                </w:p>
-              </w:tc>
-              <w:tc>
-                <w:tcPr>
-                  <w:tcW w:type="dxa" w:w="1020"/>
-                  <w:shd w:fill="f9fafb" w:val="clear"/>
-                </w:tcPr>
-                <w:p>
-                  <w:pPr>
-                    <w:spacing w:before="60" w:after="60"/>
-                    <w:jc w:val="right"/>
-                  </w:pPr>
-                  <w:r/>
-                  <w:r>
-                    <w:rPr>
-                      <w:rFonts w:ascii="Calibri" w:hAnsi="Calibri"/>
-                      <w:color w:val="374151"/>
-                      <w:sz w:val="17"/>
-                    </w:rPr>
-                    <w:t>~100 млн</w:t>
-                  </w:r>
-                </w:p>
-              </w:tc>
-              <w:tc>
-                <w:tcPr>
-                  <w:tcW w:type="dxa" w:w="1020"/>
-                  <w:shd w:fill="f9fafb" w:val="clear"/>
-                </w:tcPr>
-                <w:p>
-                  <w:pPr>
-                    <w:spacing w:before="60" w:after="60"/>
-                    <w:jc w:val="right"/>
-                  </w:pPr>
-                  <w:r/>
-                  <w:r>
-                    <w:rPr>
-                      <w:rFonts w:ascii="Calibri" w:hAnsi="Calibri"/>
-                      <w:color w:val="374151"/>
-                      <w:sz w:val="17"/>
-                    </w:rPr>
-                    <w:t>~120 млн</w:t>
-                  </w:r>
-                </w:p>
-              </w:tc>
-              <w:tc>
-                <w:tcPr>
-                  <w:tcW w:type="dxa" w:w="1020"/>
-                  <w:shd w:fill="f9fafb" w:val="clear"/>
-                </w:tcPr>
-                <w:p>
-                  <w:pPr>
-                    <w:spacing w:before="60" w:after="60"/>
-                    <w:jc w:val="right"/>
-                  </w:pPr>
-                  <w:r/>
-                  <w:r>
-                    <w:rPr>
-                      <w:rFonts w:ascii="Calibri" w:hAnsi="Calibri"/>
-                      <w:color w:val="374151"/>
-                      <w:sz w:val="17"/>
-                    </w:rPr>
-                    <w:t>~125 млн</w:t>
-                  </w:r>
-                </w:p>
-              </w:tc>
-              <w:tc>
-                <w:tcPr>
-                  <w:tcW w:type="dxa" w:w="1417"/>
-                  <w:shd w:fill="f9fafb" w:val="clear"/>
-                </w:tcPr>
-                <w:p>
-                  <w:pPr>
-                    <w:spacing w:before="60" w:after="60"/>
-                    <w:jc w:val="right"/>
-                  </w:pPr>
-                  <w:r/>
-                  <w:r>
-                    <w:rPr>
-                      <w:rFonts w:ascii="Calibri" w:hAnsi="Calibri"/>
-                      <w:b/>
-                      <w:color w:val="374151"/>
-                      <w:sz w:val="17"/>
-                    </w:rPr>
-                    <w:t>~425 млн</w:t>
-                  </w:r>
-                </w:p>
-              </w:tc>
-            </w:tr>
-            <w:tr>
-              <w:tc>
-                <w:tcPr>
-                  <w:tcW w:type="dxa" w:w="2381"/>
-                </w:tcPr>
-                <w:p>
-                  <w:pPr>
-                    <w:spacing w:before="60" w:after="60"/>
-                  </w:pPr>
-                  <w:r/>
-                  <w:r>
-                    <w:rPr>
-                      <w:rFonts w:ascii="Calibri" w:hAnsi="Calibri"/>
-                      <w:color w:val="6D28D9"/>
-                      <w:sz w:val="17"/>
-                    </w:rPr>
-                    <w:t>Экономия: страховые взносы (15%)</w:t>
-                  </w:r>
-                </w:p>
-              </w:tc>
-              <w:tc>
-                <w:tcPr>
-                  <w:tcW w:type="dxa" w:w="1020"/>
-                  <w:shd w:fill="f5f3ff" w:val="clear"/>
-                </w:tcPr>
-                <w:p>
-                  <w:pPr>
-                    <w:spacing w:before="60" w:after="60"/>
-                    <w:jc w:val="right"/>
-                  </w:pPr>
-                  <w:r/>
-                  <w:r>
-                    <w:rPr>
-                      <w:rFonts w:ascii="Calibri" w:hAnsi="Calibri"/>
-                      <w:color w:val="6D28D9"/>
-                      <w:sz w:val="17"/>
-                    </w:rPr>
-                    <w:t>~12 млн</w:t>
-                  </w:r>
-                </w:p>
-              </w:tc>
-              <w:tc>
-                <w:tcPr>
-                  <w:tcW w:type="dxa" w:w="1020"/>
-                  <w:shd w:fill="f5f3ff" w:val="clear"/>
-                </w:tcPr>
-                <w:p>
-                  <w:pPr>
-                    <w:spacing w:before="60" w:after="60"/>
-                    <w:jc w:val="right"/>
-                  </w:pPr>
-                  <w:r/>
-                  <w:r>
-                    <w:rPr>
-                      <w:rFonts w:ascii="Calibri" w:hAnsi="Calibri"/>
-                      <w:color w:val="6D28D9"/>
-                      <w:sz w:val="17"/>
-                    </w:rPr>
-                    <w:t>~15 млн</w:t>
-                  </w:r>
-                </w:p>
-              </w:tc>
-              <w:tc>
-                <w:tcPr>
-                  <w:tcW w:type="dxa" w:w="1020"/>
-                  <w:shd w:fill="f5f3ff" w:val="clear"/>
-                </w:tcPr>
-                <w:p>
-                  <w:pPr>
-                    <w:spacing w:before="60" w:after="60"/>
-                    <w:jc w:val="right"/>
-                  </w:pPr>
-                  <w:r/>
-                  <w:r>
-                    <w:rPr>
-                      <w:rFonts w:ascii="Calibri" w:hAnsi="Calibri"/>
-                      <w:color w:val="6D28D9"/>
-                      <w:sz w:val="17"/>
-                    </w:rPr>
-                    <w:t>~18 млн</w:t>
-                  </w:r>
-                </w:p>
-              </w:tc>
-              <w:tc>
-                <w:tcPr>
-                  <w:tcW w:type="dxa" w:w="1020"/>
-                  <w:shd w:fill="f5f3ff" w:val="clear"/>
-                </w:tcPr>
-                <w:p>
-                  <w:pPr>
-                    <w:spacing w:before="60" w:after="60"/>
-                    <w:jc w:val="right"/>
-                  </w:pPr>
-                  <w:r/>
-                  <w:r>
-                    <w:rPr>
-                      <w:rFonts w:ascii="Calibri" w:hAnsi="Calibri"/>
-                      <w:color w:val="6D28D9"/>
-                      <w:sz w:val="17"/>
-                    </w:rPr>
-                    <w:t>~18,8 млн</w:t>
-                  </w:r>
-                </w:p>
-              </w:tc>
-              <w:tc>
-                <w:tcPr>
-                  <w:tcW w:type="dxa" w:w="1417"/>
-                  <w:shd w:fill="f5f3ff" w:val="clear"/>
-                </w:tcPr>
-                <w:p>
-                  <w:pPr>
-                    <w:spacing w:before="60" w:after="60"/>
-                    <w:jc w:val="right"/>
-                  </w:pPr>
-                  <w:r/>
-                  <w:r>
-                    <w:rPr>
-                      <w:rFonts w:ascii="Calibri" w:hAnsi="Calibri"/>
-                      <w:b/>
-                      <w:color w:val="6D28D9"/>
-                      <w:sz w:val="17"/>
-                    </w:rPr>
-                    <w:t>~63,8 млн</w:t>
-                  </w:r>
-                </w:p>
-              </w:tc>
-            </w:tr>
-            <w:tr>
-              <w:tc>
-                <w:tcPr>
-                  <w:tcW w:type="dxa" w:w="2381"/>
-                  <w:shd w:fill="f9fafb" w:val="clear"/>
-                </w:tcPr>
-                <w:p>
-                  <w:pPr>
-                    <w:spacing w:before="60" w:after="60"/>
-                  </w:pPr>
-                  <w:r/>
-                  <w:r>
-                    <w:rPr>
-                      <w:rFonts w:ascii="Calibri" w:hAnsi="Calibri"/>
-                      <w:color w:val="D97706"/>
-                      <w:sz w:val="17"/>
-                    </w:rPr>
-                    <w:t>Экономия: налог на имущество (0%)</w:t>
-                  </w:r>
-                </w:p>
-              </w:tc>
-              <w:tc>
-                <w:tcPr>
-                  <w:tcW w:type="dxa" w:w="1020"/>
-                  <w:shd w:fill="fffbeb" w:val="clear"/>
-                </w:tcPr>
-                <w:p>
-                  <w:pPr>
-                    <w:spacing w:before="60" w:after="60"/>
-                    <w:jc w:val="right"/>
-                  </w:pPr>
-                  <w:r/>
-                  <w:r>
-                    <w:rPr>
-                      <w:rFonts w:ascii="Calibri" w:hAnsi="Calibri"/>
-                      <w:color w:val="D97706"/>
-                      <w:sz w:val="17"/>
-                    </w:rPr>
-                    <w:t>~1,3 млн</w:t>
-                  </w:r>
-                </w:p>
-              </w:tc>
-              <w:tc>
-                <w:tcPr>
-                  <w:tcW w:type="dxa" w:w="1020"/>
-                  <w:shd w:fill="fffbeb" w:val="clear"/>
-                </w:tcPr>
-                <w:p>
-                  <w:pPr>
-                    <w:spacing w:before="60" w:after="60"/>
-                    <w:jc w:val="right"/>
-                  </w:pPr>
-                  <w:r/>
-                  <w:r>
-                    <w:rPr>
-                      <w:rFonts w:ascii="Calibri" w:hAnsi="Calibri"/>
-                      <w:color w:val="D97706"/>
-                      <w:sz w:val="17"/>
-                    </w:rPr>
-                    <w:t>~2,0 млн</w:t>
-                  </w:r>
-                </w:p>
-              </w:tc>
-              <w:tc>
-                <w:tcPr>
-                  <w:tcW w:type="dxa" w:w="1020"/>
-                  <w:shd w:fill="fffbeb" w:val="clear"/>
-                </w:tcPr>
-                <w:p>
-                  <w:pPr>
-                    <w:spacing w:before="60" w:after="60"/>
-                    <w:jc w:val="right"/>
-                  </w:pPr>
-                  <w:r/>
-                  <w:r>
-                    <w:rPr>
-                      <w:rFonts w:ascii="Calibri" w:hAnsi="Calibri"/>
-                      <w:color w:val="D97706"/>
-                      <w:sz w:val="17"/>
-                    </w:rPr>
-                    <w:t>~3,5 млн</w:t>
-                  </w:r>
-                </w:p>
-              </w:tc>
-              <w:tc>
-                <w:tcPr>
-                  <w:tcW w:type="dxa" w:w="1020"/>
-                  <w:shd w:fill="fffbeb" w:val="clear"/>
-                </w:tcPr>
-                <w:p>
-                  <w:pPr>
-                    <w:spacing w:before="60" w:after="60"/>
-                    <w:jc w:val="right"/>
-                  </w:pPr>
-                  <w:r/>
-                  <w:r>
-                    <w:rPr>
-                      <w:rFonts w:ascii="Calibri" w:hAnsi="Calibri"/>
-                      <w:color w:val="D97706"/>
-                      <w:sz w:val="17"/>
-                    </w:rPr>
-                    <w:t>~2,8 млн</w:t>
-                  </w:r>
-                </w:p>
-              </w:tc>
-              <w:tc>
-                <w:tcPr>
-                  <w:tcW w:type="dxa" w:w="1417"/>
-                  <w:shd w:fill="fffbeb" w:val="clear"/>
-                </w:tcPr>
-                <w:p>
-                  <w:pPr>
-                    <w:spacing w:before="60" w:after="60"/>
-                    <w:jc w:val="right"/>
-                  </w:pPr>
-                  <w:r/>
-                  <w:r>
-                    <w:rPr>
-                      <w:rFonts w:ascii="Calibri" w:hAnsi="Calibri"/>
-                      <w:b/>
-                      <w:color w:val="D97706"/>
-                      <w:sz w:val="17"/>
-                    </w:rPr>
-                    <w:t>~9,6 млн</w:t>
-                  </w:r>
-                </w:p>
-              </w:tc>
-            </w:tr>
-          </w:tbl>
-          <w:p/>
-          <w:tbl>
-            <w:tblPr>
-              <w:tblBorders>
-                <w:top w:val="single" w:sz="8" w:space="0" w:color="fecaca"/>
-                <w:bottom w:val="single" w:sz="8" w:space="0" w:color="fecaca"/>
-                <w:left w:val="single" w:sz="8" w:space="0" w:color="fecaca"/>
-                <w:right w:val="single" w:sz="8" w:space="0" w:color="fecaca"/>
-              </w:tblBorders>
-            </w:tblPr>
-            <w:tblGrid>
-              <w:gridCol w:w="9071"/>
-            </w:tblGrid>
-            <w:tr>
-              <w:tc>
-                <w:tcPr>
-                  <w:tcW w:type="dxa" w:w="8787"/>
-                  <w:shd w:fill="fef2f2" w:val="clear"/>
-                </w:tcPr>
-                <w:p>
-                  <w:pPr>
-                    <w:spacing w:before="120" w:after="120"/>
-                  </w:pPr>
-                  <w:r/>
-                  <w:r>
-                    <w:rPr>
-                      <w:rFonts w:ascii="Calibri" w:hAnsi="Calibri"/>
-                      <w:b/>
-                      <w:color w:val="DC2626"/>
-                      <w:sz w:val="24"/>
-                    </w:rPr>
-                    <w:t>🔥 ИТОГО ЭКОНОМИЯ ЗА 4 ГОДА: ~134,7 млн ₽</w:t>
-                    <w:br/>
-                    <w:t>Если бы мы уже были резидентом Сколково</w:t>
-                  </w:r>
-                </w:p>
-              </w:tc>
-            </w:tr>
-          </w:tbl>
-          <w:p/>
-          <w:tbl>
-            <w:tblPr>
-              <w:tblBorders>
-                <w:top w:val="single" w:sz="8" w:space="0" w:color="fdba74"/>
-                <w:bottom w:val="single" w:sz="8" w:space="0" w:color="fdba74"/>
-                <w:left w:val="single" w:sz="8" w:space="0" w:color="fdba74"/>
-                <w:right w:val="single" w:sz="8" w:space="0" w:color="fdba74"/>
-              </w:tblBorders>
-            </w:tblPr>
-            <w:tblGrid>
-              <w:gridCol w:w="9071"/>
-            </w:tblGrid>
-            <w:tr>
-              <w:tc>
-                <w:tcPr>
-                  <w:tcW w:type="dxa" w:w="8787"/>
-                  <w:shd w:fill="fff7ed" w:val="clear"/>
-                </w:tcPr>
-                <w:p>
-                  <w:pPr>
-                    <w:spacing w:before="120" w:after="120"/>
-                  </w:pPr>
-                  <w:r/>
-                  <w:r>
-                    <w:rPr>
-                      <w:rFonts w:ascii="Calibri" w:hAnsi="Calibri"/>
-                      <w:b/>
-                      <w:color w:val="C2410C"/>
-                      <w:sz w:val="24"/>
-                    </w:rPr>
-                    <w:t>🔮 ПРОГНОЗ НА 10 ЛЕТ: от 335 до 435 млн ₽</w:t>
-                    <w:br/>
-                    <w:t>или ~34–44 млн ₽/год</w:t>
-                  </w:r>
-                </w:p>
-              </w:tc>
-            </w:tr>
-          </w:tbl>
-          <w:p/>
-          <w:tbl>
-            <w:tblPr>
-              <w:tblBorders>
-                <w:top w:val="single" w:sz="8" w:space="0" w:color="fca5a5"/>
-                <w:bottom w:val="single" w:sz="8" w:space="0" w:color="fca5a5"/>
-                <w:left w:val="single" w:sz="8" w:space="0" w:color="fca5a5"/>
-                <w:right w:val="single" w:sz="8" w:space="0" w:color="fca5a5"/>
-              </w:tblBorders>
-            </w:tblPr>
-            <w:tblGrid>
-              <w:gridCol w:w="9071"/>
-            </w:tblGrid>
-            <w:tr>
-              <w:tc>
-                <w:tcPr>
-                  <w:tcW w:type="dxa" w:w="8787"/>
-                  <w:shd w:fill="fef2f2" w:val="clear"/>
-                </w:tcPr>
-                <w:p>
-                  <w:pPr>
-                    <w:spacing w:before="120" w:after="120"/>
-                  </w:pPr>
-                  <w:r/>
-                  <w:r>
-                    <w:rPr>
-                      <w:rFonts w:ascii="Calibri" w:hAnsi="Calibri"/>
-                      <w:b/>
-                      <w:color w:val="991B1B"/>
-                      <w:sz w:val="20"/>
-                    </w:rPr>
-                    <w:t>⚡ Каждый год промедления = ~34–44 млн ₽ упущенной экономии.</w:t>
-                  </w:r>
-                </w:p>
-              </w:tc>
-            </w:tr>
-          </w:tbl>
-          <w:p/>
         </w:tc>
       </w:tr>
     </w:tbl>
-    <w:p>
-      <w:pPr>
-        <w:spacing w:before="60" w:after="0"/>
-      </w:pPr>
-    </w:p>
     <w:tbl>
       <w:tblPr>
-        <w:tblBorders>
-          <w:top w:val="single" w:sz="6" w:space="0" w:color="e5e7eb"/>
-          <w:bottom w:val="single" w:sz="6" w:space="0" w:color="e5e7eb"/>
-          <w:left w:val="single" w:sz="6" w:space="0" w:color="e5e7eb"/>
-          <w:right w:val="single" w:sz="6" w:space="0" w:color="e5e7eb"/>
-        </w:tblBorders>
+        <w:tblW w:type="auto" w:w="0"/>
+        <w:tblLook w:firstColumn="1" w:firstRow="1" w:lastColumn="0" w:lastRow="0" w:noHBand="0" w:noVBand="1" w:val="04A0"/>
       </w:tblPr>
       <w:tblGrid>
-        <w:gridCol w:w="9972"/>
+        <w:gridCol w:w="9406"/>
       </w:tblGrid>
       <w:tr>
         <w:tc>
           <w:tcPr>
-            <w:tcW w:type="dxa" w:w="9071"/>
-            <w:shd w:fill="f3f4f6" w:val="clear"/>
+            <w:tcW w:type="dxa" w:w="9406"/>
           </w:tcPr>
           <w:p>
-            <w:pPr>
-              <w:spacing w:before="140" w:after="140"/>
-            </w:pPr>
-            <w:r/>
             <w:r>
               <w:rPr>
-                <w:rFonts w:ascii="Calibri" w:hAnsi="Calibri"/>
                 <w:b/>
-                <w:color w:val="111827"/>
-                <w:sz w:val="20"/>
+                <w:sz w:val="22"/>
               </w:rPr>
               <w:t>4️⃣ Интеллектуальная собственность</w:t>
             </w:r>
@@ -1726,159 +353,40 @@
       <w:tr>
         <w:tc>
           <w:tcPr>
-            <w:tcW w:type="dxa" w:w="9071"/>
+            <w:tcW w:type="dxa" w:w="9406"/>
           </w:tcPr>
           <w:p>
-            <w:r/>
+            <w:r>
+              <w:t>Действующие патенты не обнаружены в открытых источниках.</w:t>
+              <w:br/>
+              <w:br/>
+              <w:t>Рекомендуется подача заявки на полезную модель по тематике: технологию производства металлоконструкций с повышенной прочностью и коррозионной стойкостью.</w:t>
+              <w:br/>
+              <w:br/>
+              <w:t>Подача патента осуществляется параллельно с заявкой в Сколково (срок получения патента: 4–5 месяцев).</w:t>
+            </w:r>
           </w:p>
-          <w:tbl>
-            <w:tblPr>
-              <w:tblBorders>
-                <w:top w:val="single" w:sz="8" w:space="0" w:color="fca5a5"/>
-                <w:bottom w:val="single" w:sz="8" w:space="0" w:color="fca5a5"/>
-                <w:left w:val="single" w:sz="8" w:space="0" w:color="fca5a5"/>
-                <w:right w:val="single" w:sz="8" w:space="0" w:color="fca5a5"/>
-              </w:tblBorders>
-            </w:tblPr>
-            <w:tblGrid>
-              <w:gridCol w:w="9071"/>
-            </w:tblGrid>
-            <w:tr>
-              <w:tc>
-                <w:tcPr>
-                  <w:tcW w:type="dxa" w:w="8787"/>
-                  <w:shd w:fill="fee2e2" w:val="clear"/>
-                </w:tcPr>
-                <w:p>
-                  <w:pPr>
-                    <w:spacing w:before="120" w:after="120"/>
-                  </w:pPr>
-                  <w:r/>
-                  <w:r>
-                    <w:rPr>
-                      <w:rFonts w:ascii="Calibri" w:hAnsi="Calibri"/>
-                      <w:b/>
-                      <w:color w:val="991B1B"/>
-                      <w:sz w:val="19"/>
-                    </w:rPr>
-                    <w:t>✗ Зарегистрированные патенты и заявки — Не найдены</w:t>
-                  </w:r>
-                </w:p>
-              </w:tc>
-            </w:tr>
-          </w:tbl>
-          <w:p/>
-          <w:tbl>
-            <w:tblPr>
-              <w:tblBorders>
-                <w:top w:val="single" w:sz="8" w:space="0" w:color="86efac"/>
-                <w:bottom w:val="single" w:sz="8" w:space="0" w:color="86efac"/>
-                <w:left w:val="single" w:sz="8" w:space="0" w:color="86efac"/>
-                <w:right w:val="single" w:sz="8" w:space="0" w:color="86efac"/>
-              </w:tblBorders>
-            </w:tblPr>
-            <w:tblGrid>
-              <w:gridCol w:w="9071"/>
-            </w:tblGrid>
-            <w:tr>
-              <w:tc>
-                <w:tcPr>
-                  <w:tcW w:type="dxa" w:w="8787"/>
-                  <w:shd w:fill="dcfce7" w:val="clear"/>
-                </w:tcPr>
-                <w:p>
-                  <w:pPr>
-                    <w:spacing w:before="120" w:after="120"/>
-                  </w:pPr>
-                  <w:r/>
-                  <w:r>
-                    <w:rPr>
-                      <w:rFonts w:ascii="Calibri" w:hAnsi="Calibri"/>
-                      <w:b/>
-                      <w:color w:val="166534"/>
-                      <w:sz w:val="19"/>
-                    </w:rPr>
-                    <w:t>✓ Конструкторский отдел (ноу-хау) — Подтверждён</w:t>
-                  </w:r>
-                </w:p>
-              </w:tc>
-            </w:tr>
-          </w:tbl>
-          <w:p/>
-          <w:tbl>
-            <w:tblPr>
-              <w:tblBorders>
-                <w:top w:val="single" w:sz="8" w:space="0" w:color="93c5fd"/>
-                <w:bottom w:val="single" w:sz="8" w:space="0" w:color="93c5fd"/>
-                <w:left w:val="single" w:sz="8" w:space="0" w:color="93c5fd"/>
-                <w:right w:val="single" w:sz="8" w:space="0" w:color="93c5fd"/>
-              </w:tblBorders>
-            </w:tblPr>
-            <w:tblGrid>
-              <w:gridCol w:w="9071"/>
-            </w:tblGrid>
-            <w:tr>
-              <w:tc>
-                <w:tcPr>
-                  <w:tcW w:type="dxa" w:w="8787"/>
-                  <w:shd w:fill="eff6ff" w:val="clear"/>
-                </w:tcPr>
-                <w:p>
-                  <w:pPr>
-                    <w:spacing w:before="120" w:after="120"/>
-                  </w:pPr>
-                  <w:r/>
-                  <w:r>
-                    <w:rPr>
-                      <w:rFonts w:ascii="Calibri" w:hAnsi="Calibri"/>
-                      <w:b/>
-                      <w:color w:val="1E40AF"/>
-                      <w:sz w:val="19"/>
-                    </w:rPr>
-                    <w:t>💡 Что нужно для заявки: минимум 1 патент или заявка на полезную модель. Мы можем подать заявку на патент параллельно с заявкой в Сколково (4–5 мес., ~90 тыс. ₽).</w:t>
-                  </w:r>
-                </w:p>
-              </w:tc>
-            </w:tr>
-          </w:tbl>
-          <w:p/>
         </w:tc>
       </w:tr>
     </w:tbl>
-    <w:p>
-      <w:pPr>
-        <w:spacing w:before="60" w:after="0"/>
-      </w:pPr>
-    </w:p>
     <w:tbl>
       <w:tblPr>
-        <w:tblBorders>
-          <w:top w:val="single" w:sz="6" w:space="0" w:color="e5e7eb"/>
-          <w:bottom w:val="single" w:sz="6" w:space="0" w:color="e5e7eb"/>
-          <w:left w:val="single" w:sz="6" w:space="0" w:color="e5e7eb"/>
-          <w:right w:val="single" w:sz="6" w:space="0" w:color="e5e7eb"/>
-        </w:tblBorders>
+        <w:tblW w:type="auto" w:w="0"/>
+        <w:tblLook w:firstColumn="1" w:firstRow="1" w:lastColumn="0" w:lastRow="0" w:noHBand="0" w:noVBand="1" w:val="04A0"/>
       </w:tblPr>
       <w:tblGrid>
-        <w:gridCol w:w="9972"/>
+        <w:gridCol w:w="9406"/>
       </w:tblGrid>
       <w:tr>
         <w:tc>
           <w:tcPr>
-            <w:tcW w:type="dxa" w:w="9071"/>
-            <w:shd w:fill="f3f4f6" w:val="clear"/>
+            <w:tcW w:type="dxa" w:w="9406"/>
           </w:tcPr>
           <w:p>
-            <w:pPr>
-              <w:spacing w:before="140" w:after="140"/>
-            </w:pPr>
-            <w:r/>
             <w:r>
               <w:rPr>
-                <w:rFonts w:ascii="Calibri" w:hAnsi="Calibri"/>
                 <w:b/>
-                <w:color w:val="111827"/>
-                <w:sz w:val="20"/>
+                <w:sz w:val="22"/>
               </w:rPr>
               <w:t>5️⃣ Связанные компании</w:t>
             </w:r>
@@ -1888,143 +396,34 @@
       <w:tr>
         <w:tc>
           <w:tcPr>
-            <w:tcW w:type="dxa" w:w="9071"/>
+            <w:tcW w:type="dxa" w:w="9406"/>
           </w:tcPr>
           <w:p>
-            <w:r/>
-          </w:p>
-          <w:p>
-            <w:pPr>
-              <w:spacing w:after="60" w:before="0"/>
-            </w:pPr>
             <w:r>
-              <w:rPr>
-                <w:rFonts w:ascii="Calibri" w:hAnsi="Calibri"/>
-                <w:color w:val="374151"/>
-                <w:sz w:val="19"/>
-              </w:rPr>
-              <w:t>Через учредителя (Ершова Е.А.) связана одна компания:</w:t>
+              <w:t>Не обнаружены (или уточняется).</w:t>
             </w:r>
           </w:p>
-          <w:tbl>
-            <w:tblPr>
-              <w:tblBorders>
-                <w:top w:val="single" w:sz="8" w:space="0" w:color="e5e7eb"/>
-                <w:bottom w:val="single" w:sz="8" w:space="0" w:color="e5e7eb"/>
-                <w:left w:val="single" w:sz="8" w:space="0" w:color="e5e7eb"/>
-                <w:right w:val="single" w:sz="8" w:space="0" w:color="e5e7eb"/>
-              </w:tblBorders>
-            </w:tblPr>
-            <w:tblGrid>
-              <w:gridCol w:w="9071"/>
-            </w:tblGrid>
-            <w:tr>
-              <w:tc>
-                <w:tcPr>
-                  <w:tcW w:type="dxa" w:w="8787"/>
-                  <w:shd w:fill="f9fafb" w:val="clear"/>
-                </w:tcPr>
-                <w:p>
-                  <w:pPr>
-                    <w:spacing w:before="120" w:after="120"/>
-                  </w:pPr>
-                  <w:r/>
-                  <w:r>
-                    <w:rPr>
-                      <w:rFonts w:ascii="Calibri" w:hAnsi="Calibri"/>
-                      <w:b/>
-                      <w:color w:val="6B7280"/>
-                      <w:sz w:val="19"/>
-                    </w:rPr>
-                    <w:t>ООО НПК «ТРАНСМАШ» (ИНН 2703092545)</w:t>
-                    <w:br/>
-                    <w:t>50% учредитель — Ершова Е.А.</w:t>
-                    <w:br/>
-                    <w:t>ОКВЭД 46.69 — оптовая торговля ❌</w:t>
-                    <w:br/>
-                    <w:t>Выручка: 0 ₽ · 1 сотрудник</w:t>
-                    <w:br/>
-                    <w:t>Торговый ОКВЭД — не подходит для Сколково.</w:t>
-                  </w:r>
-                </w:p>
-              </w:tc>
-            </w:tr>
-          </w:tbl>
-          <w:p/>
-          <w:tbl>
-            <w:tblPr>
-              <w:tblBorders>
-                <w:top w:val="single" w:sz="8" w:space="0" w:color="93c5fd"/>
-                <w:bottom w:val="single" w:sz="8" w:space="0" w:color="93c5fd"/>
-                <w:left w:val="single" w:sz="8" w:space="0" w:color="93c5fd"/>
-                <w:right w:val="single" w:sz="8" w:space="0" w:color="93c5fd"/>
-              </w:tblBorders>
-            </w:tblPr>
-            <w:tblGrid>
-              <w:gridCol w:w="9071"/>
-            </w:tblGrid>
-            <w:tr>
-              <w:tc>
-                <w:tcPr>
-                  <w:tcW w:type="dxa" w:w="8787"/>
-                  <w:shd w:fill="eff6ff" w:val="clear"/>
-                </w:tcPr>
-                <w:p>
-                  <w:pPr>
-                    <w:spacing w:before="120" w:after="120"/>
-                  </w:pPr>
-                  <w:r/>
-                  <w:r>
-                    <w:rPr>
-                      <w:rFonts w:ascii="Calibri" w:hAnsi="Calibri"/>
-                      <w:b/>
-                      <w:color w:val="1E40AF"/>
-                      <w:sz w:val="18"/>
-                    </w:rPr>
-                    <w:t>⚡ Критерий для справки: Для Сколково подходят компании с основным ОКВЭД из сфер производства, IT или НИОКР. Торговля — не подходит.</w:t>
-                  </w:r>
-                </w:p>
-              </w:tc>
-            </w:tr>
-          </w:tbl>
-          <w:p/>
         </w:tc>
       </w:tr>
     </w:tbl>
-    <w:p>
-      <w:pPr>
-        <w:spacing w:before="60" w:after="0"/>
-      </w:pPr>
-    </w:p>
     <w:tbl>
       <w:tblPr>
-        <w:tblBorders>
-          <w:top w:val="single" w:sz="6" w:space="0" w:color="c4b5fd"/>
-          <w:bottom w:val="single" w:sz="6" w:space="0" w:color="c4b5fd"/>
-          <w:left w:val="single" w:sz="6" w:space="0" w:color="c4b5fd"/>
-          <w:right w:val="single" w:sz="6" w:space="0" w:color="c4b5fd"/>
-        </w:tblBorders>
+        <w:tblW w:type="auto" w:w="0"/>
+        <w:tblLook w:firstColumn="1" w:firstRow="1" w:lastColumn="0" w:lastRow="0" w:noHBand="0" w:noVBand="1" w:val="04A0"/>
       </w:tblPr>
       <w:tblGrid>
-        <w:gridCol w:w="9972"/>
+        <w:gridCol w:w="9406"/>
       </w:tblGrid>
       <w:tr>
         <w:tc>
           <w:tcPr>
-            <w:tcW w:type="dxa" w:w="9071"/>
-            <w:shd w:fill="eef2ff" w:val="clear"/>
+            <w:tcW w:type="dxa" w:w="9406"/>
           </w:tcPr>
           <w:p>
-            <w:pPr>
-              <w:spacing w:before="140" w:after="140"/>
-            </w:pPr>
-            <w:r/>
             <w:r>
               <w:rPr>
-                <w:rFonts w:ascii="Calibri" w:hAnsi="Calibri"/>
                 <w:b/>
-                <w:color w:val="4C1D95"/>
-                <w:sz w:val="20"/>
+                <w:sz w:val="22"/>
               </w:rPr>
               <w:t>🎯 План действий</w:t>
             </w:r>
@@ -2034,117 +433,31 @@
       <w:tr>
         <w:tc>
           <w:tcPr>
-            <w:tcW w:type="dxa" w:w="9071"/>
+            <w:tcW w:type="dxa" w:w="9406"/>
           </w:tcPr>
           <w:p>
-            <w:r/>
-          </w:p>
-          <w:p>
-            <w:pPr>
-              <w:spacing w:after="0" w:before="80"/>
-            </w:pPr>
             <w:r>
-              <w:rPr>
-                <w:rFonts w:ascii="Calibri" w:hAnsi="Calibri"/>
-                <w:b/>
-                <w:color w:val="4338CA"/>
-                <w:sz w:val="20"/>
-              </w:rPr>
               <w:t>1. Согласовать продукт-инновацию</w:t>
-            </w:r>
-          </w:p>
-          <w:p>
-            <w:pPr>
-              <w:spacing w:after="40" w:before="0"/>
-            </w:pPr>
-            <w:r>
-              <w:rPr>
-                <w:rFonts w:ascii="Calibri" w:hAnsi="Calibri"/>
-                <w:color w:val="6B7280"/>
-                <w:sz w:val="18"/>
-              </w:rPr>
-              <w:t>Определить, какой продукт или технологию заявлять как инновацию для Сколково</w:t>
-            </w:r>
-          </w:p>
-          <w:p>
-            <w:pPr>
-              <w:spacing w:after="0" w:before="80"/>
-            </w:pPr>
-            <w:r>
-              <w:rPr>
-                <w:rFonts w:ascii="Calibri" w:hAnsi="Calibri"/>
-                <w:b/>
-                <w:color w:val="4338CA"/>
-                <w:sz w:val="20"/>
-              </w:rPr>
-              <w:t>2. Подать заявку на патент</w:t>
-            </w:r>
-          </w:p>
-          <w:p>
-            <w:pPr>
-              <w:spacing w:after="40" w:before="0"/>
-            </w:pPr>
-            <w:r>
-              <w:rPr>
-                <w:rFonts w:ascii="Calibri" w:hAnsi="Calibri"/>
-                <w:color w:val="6B7280"/>
-                <w:sz w:val="18"/>
-              </w:rPr>
-              <w:t>Полезная модель — параллельно с заявкой в Сколково, 4–5 месяцев</w:t>
-            </w:r>
-          </w:p>
-          <w:p>
-            <w:pPr>
-              <w:spacing w:after="0" w:before="80"/>
-            </w:pPr>
-            <w:r>
-              <w:rPr>
-                <w:rFonts w:ascii="Calibri" w:hAnsi="Calibri"/>
-                <w:b/>
-                <w:color w:val="4338CA"/>
-                <w:sz w:val="20"/>
-              </w:rPr>
-              <w:t>3. Подать заявку в Сколково</w:t>
-            </w:r>
-          </w:p>
-          <w:p>
-            <w:pPr>
-              <w:spacing w:after="40" w:before="0"/>
-            </w:pPr>
-            <w:r>
-              <w:rPr>
-                <w:rFonts w:ascii="Calibri" w:hAnsi="Calibri"/>
-                <w:color w:val="6B7280"/>
-                <w:sz w:val="18"/>
-              </w:rPr>
-              <w:t>После утверждения продукта и подачи патентной заявки</w:t>
-            </w:r>
-          </w:p>
-          <w:p>
-            <w:pPr>
-              <w:spacing w:after="0" w:before="80"/>
-            </w:pPr>
-            <w:r>
-              <w:rPr>
-                <w:rFonts w:ascii="Calibri" w:hAnsi="Calibri"/>
-                <w:b/>
-                <w:color w:val="4338CA"/>
-                <w:sz w:val="20"/>
-              </w:rPr>
-              <w:t>4. Наладить отчётность резидента</w:t>
-            </w:r>
-          </w:p>
-          <w:p>
-            <w:pPr>
-              <w:spacing w:after="40" w:before="0"/>
-            </w:pPr>
-            <w:r>
-              <w:rPr>
-                <w:rFonts w:ascii="Calibri" w:hAnsi="Calibri"/>
-                <w:color w:val="6B7280"/>
-                <w:sz w:val="18"/>
-              </w:rPr>
-              <w:t>4 квартальных + 1 годовой отчёт — делаем сами или с нашей поддержкой</w:t>
+              <w:br/>
+              <w:t xml:space="preserve">   Определить, какой именно продукт/технология соответствуют критериям Сколково. Гипотеза: технологию производства металлоконструкций с повышенной прочностью и коррозионной стойкостью.</w:t>
+              <w:br/>
+              <w:br/>
+              <w:t>2. Собрать базовые документы</w:t>
+              <w:br/>
+              <w:t xml:space="preserve">   Учредительные документы, штатное расписание, документы сотрудников (дипломы).</w:t>
+              <w:br/>
+              <w:br/>
+              <w:t>3. Подать заявку на патент</w:t>
+              <w:br/>
+              <w:t xml:space="preserve">   Полезная модель по тематике металлообработки.</w:t>
+              <w:br/>
+              <w:br/>
+              <w:t>4. Сформировать заявку в Сколково</w:t>
+              <w:br/>
+              <w:t xml:space="preserve">   Используя собранные данные и подготовленные документы.</w:t>
+              <w:br/>
+              <w:br/>
+              <w:t>5. Подать заявку на МТК (после получения статуса Сколково)</w:t>
             </w:r>
           </w:p>
         </w:tc>
@@ -2152,26 +465,31 @@
     </w:tbl>
     <w:p>
       <w:pPr>
-        <w:spacing w:before="60" w:after="0"/>
-      </w:pPr>
-    </w:p>
-    <w:p>
-      <w:pPr>
-        <w:spacing w:before="120"/>
         <w:jc w:val="center"/>
       </w:pPr>
       <w:r>
         <w:rPr>
-          <w:rFonts w:ascii="Calibri" w:hAnsi="Calibri"/>
-          <w:color w:val="9CA3AF"/>
+          <w:color w:val="B4B4B4"/>
           <w:sz w:val="16"/>
         </w:rPr>
-        <w:t>Источники: audit-it.ru, testfirm.ru, zachestnyibiznes.ru, rusprofile.ru, list-org.com · 09.07.2026</w:t>
+        <w:t>———————————————————————————————————————————————————————</w:t>
+      </w:r>
+    </w:p>
+    <w:p>
+      <w:pPr>
+        <w:jc w:val="center"/>
+      </w:pPr>
+      <w:r>
+        <w:rPr>
+          <w:color w:val="646464"/>
+          <w:sz w:val="18"/>
+        </w:rPr>
+        <w:t>Источники: audit-it.ru, saby.ru · 09.07.2026</w:t>
       </w:r>
     </w:p>
     <w:sectPr>
       <w:pgSz w:w="12240" w:h="15840"/>
-      <w:pgMar w:top="850" w:right="1134" w:bottom="850" w:left="1134" w:header="720" w:footer="720" w:gutter="0"/>
+      <w:pgMar w:top="1134" w:right="1417" w:bottom="1134" w:left="1417" w:header="720" w:footer="720" w:gutter="0"/>
       <w:cols w:space="720"/>
       <w:docGrid w:linePitch="360"/>
     </w:sectPr>
@@ -2543,7 +861,7 @@
     <w:qFormat/>
     <w:rsid w:val="00FC693F"/>
     <w:rPr>
-      <w:rFonts w:ascii="Calibri" w:hAnsi="Calibri"/>
+      <w:rFonts w:ascii="Arial" w:hAnsi="Arial"/>
       <w:sz w:val="20"/>
     </w:rPr>
   </w:style>

</xml_diff>

<commit_message>
Update clients/region/analitika_REGION.docx — proper formatting
</commit_message>
<xml_diff>
--- a/clients/region/analitika_REGION.docx
+++ b/clients/region/analitika_REGION.docx
@@ -2,87 +2,37 @@
 <file path=word/document.xml><?xml version="1.0" encoding="utf-8"?>
 <w:document xmlns:wpc="http://schemas.microsoft.com/office/word/2010/wordprocessingCanvas" xmlns:mo="http://schemas.microsoft.com/office/mac/office/2008/main" xmlns:mc="http://schemas.openxmlformats.org/markup-compatibility/2006" xmlns:mv="urn:schemas-microsoft-com:mac:vml" xmlns:o="urn:schemas-microsoft-com:office:office" xmlns:r="http://schemas.openxmlformats.org/officeDocument/2006/relationships" xmlns:m="http://schemas.openxmlformats.org/officeDocument/2006/math" xmlns:v="urn:schemas-microsoft-com:vml" xmlns:wp14="http://schemas.microsoft.com/office/word/2010/wordprocessingDrawing" xmlns:wp="http://schemas.openxmlformats.org/drawingml/2006/wordprocessingDrawing" xmlns:w10="urn:schemas-microsoft-com:office:word" xmlns:w="http://schemas.openxmlformats.org/wordprocessingml/2006/main" xmlns:w14="http://schemas.microsoft.com/office/word/2010/wordml" xmlns:wpg="http://schemas.microsoft.com/office/word/2010/wordprocessingGroup" xmlns:wpi="http://schemas.microsoft.com/office/word/2010/wordprocessingInk" xmlns:wne="http://schemas.microsoft.com/office/word/2006/wordml" xmlns:wps="http://schemas.microsoft.com/office/word/2010/wordprocessingShape" mc:Ignorable="w14 wp14">
   <w:body>
-    <w:p>
-      <w:pPr>
-        <w:jc w:val="center"/>
-      </w:pPr>
-      <w:r>
-        <w:rPr>
-          <w:rFonts w:ascii="Arial" w:hAnsi="Arial"/>
-          <w:b/>
-          <w:sz w:val="18"/>
-        </w:rPr>
-        <w:t>КОНСАЛТИНГОВАЯ КОМПАНИЯ</w:t>
-      </w:r>
-    </w:p>
-    <w:p>
-      <w:pPr>
-        <w:jc w:val="center"/>
-      </w:pPr>
-      <w:r>
-        <w:rPr>
-          <w:rFonts w:ascii="Arial" w:hAnsi="Arial"/>
-          <w:sz w:val="18"/>
-        </w:rPr>
-        <w:t>ANDROMEDA CONSULT</w:t>
-      </w:r>
-    </w:p>
-    <w:p>
-      <w:pPr>
-        <w:jc w:val="center"/>
-      </w:pPr>
-      <w:r>
-        <w:rPr>
-          <w:rFonts w:ascii="Arial" w:hAnsi="Arial"/>
-          <w:sz w:val="18"/>
-        </w:rPr>
-        <w:t>ИНН 7702464831  |  ОГРН 1197746181038  |  КПП 770201001</w:t>
-      </w:r>
-    </w:p>
-    <w:p>
-      <w:pPr>
-        <w:jc w:val="center"/>
-      </w:pPr>
-      <w:r>
-        <w:rPr>
-          <w:rFonts w:ascii="Arial" w:hAnsi="Arial"/>
-          <w:sz w:val="18"/>
-        </w:rPr>
-        <w:t>info@andromedaconsult.ru  |  andromedaconsult.ru  |  @andromedaconsult</w:t>
-      </w:r>
-    </w:p>
-    <w:p>
-      <w:pPr>
-        <w:jc w:val="center"/>
-      </w:pPr>
-      <w:r>
-        <w:rPr>
-          <w:color w:val="B4B4B4"/>
-          <w:sz w:val="16"/>
-        </w:rPr>
-        <w:t>=======================================================</w:t>
-      </w:r>
-    </w:p>
     <w:tbl>
       <w:tblPr>
-        <w:tblW w:type="auto" w:w="0"/>
-        <w:tblLook w:firstColumn="1" w:firstRow="1" w:lastColumn="0" w:lastRow="0" w:noHBand="0" w:noVBand="1" w:val="04A0"/>
+        <w:tblBorders>
+          <w:top w:val="single" w:sz="6" w:space="0" w:color="1e293b"/>
+          <w:bottom w:val="single" w:sz="6" w:space="0" w:color="1e293b"/>
+          <w:left w:val="single" w:sz="6" w:space="0" w:color="1e293b"/>
+          <w:right w:val="single" w:sz="6" w:space="0" w:color="1e293b"/>
+        </w:tblBorders>
       </w:tblPr>
       <w:tblGrid>
-        <w:gridCol w:w="9406"/>
+        <w:gridCol w:w="9972"/>
       </w:tblGrid>
       <w:tr>
         <w:tc>
           <w:tcPr>
-            <w:tcW w:type="dxa" w:w="9406"/>
+            <w:tcW w:type="dxa" w:w="9071"/>
+            <w:shd w:fill="1e293b" w:val="clear"/>
           </w:tcPr>
           <w:p>
+            <w:pPr>
+              <w:spacing w:before="140" w:after="140"/>
+            </w:pPr>
+            <w:r/>
             <w:r>
               <w:rPr>
+                <w:rFonts w:ascii="Calibri" w:hAnsi="Calibri"/>
                 <w:b/>
-                <w:sz w:val="26"/>
+                <w:color w:val="FFFFFF"/>
+                <w:sz w:val="20"/>
               </w:rPr>
-              <w:t>ООО «РЕГИОН» · Предварительный анализ для Сколково</w:t>
+              <w:t>ООО «РЕГИОН» · Предварительный анализ для Сколково · 09.07.2026</w:t>
             </w:r>
           </w:p>
         </w:tc>
@@ -90,7 +40,7 @@
       <w:tr>
         <w:tc>
           <w:tcPr>
-            <w:tcW w:type="dxa" w:w="9406"/>
+            <w:tcW w:type="dxa" w:w="9071"/>
           </w:tcPr>
           <w:p>
             <w:r/>
@@ -99,41 +49,105 @@
       </w:tr>
     </w:tbl>
     <w:p>
+      <w:pPr>
+        <w:spacing w:after="40" w:before="0" w:line="240" w:lineRule="auto"/>
+      </w:pPr>
       <w:r>
         <w:rPr>
-          <w:color w:val="646464"/>
+          <w:rFonts w:ascii="Calibri" w:hAnsi="Calibri"/>
+          <w:b/>
+          <w:color w:val="1E293B"/>
           <w:sz w:val="18"/>
         </w:rPr>
-        <w:t>09 июля 2026 г.</w:t>
+        <w:t>КОНСАЛТИНГОВАЯ КОМПАНИЯ</w:t>
       </w:r>
     </w:p>
     <w:p>
+      <w:pPr>
+        <w:spacing w:after="40" w:before="0" w:line="240" w:lineRule="auto"/>
+      </w:pPr>
       <w:r>
         <w:rPr>
-          <w:color w:val="B4B4B4"/>
+          <w:rFonts w:ascii="Calibri" w:hAnsi="Calibri"/>
+          <w:b/>
+          <w:color w:val="1E293B"/>
+          <w:sz w:val="32"/>
+        </w:rPr>
+        <w:t>ANDROMEDA CONSULT</w:t>
+      </w:r>
+    </w:p>
+    <w:p>
+      <w:pPr>
+        <w:spacing w:after="40" w:before="0" w:line="240" w:lineRule="auto"/>
+      </w:pPr>
+      <w:r>
+        <w:rPr>
+          <w:rFonts w:ascii="Calibri" w:hAnsi="Calibri"/>
+          <w:color w:val="64748B"/>
           <w:sz w:val="16"/>
         </w:rPr>
-        <w:t>———————————————————————————————————————————————————————</w:t>
+        <w:t>ИНН 7702464831  |  ОГРН 1197746181038  |  КПП 770201001</w:t>
       </w:r>
+    </w:p>
+    <w:p>
+      <w:pPr>
+        <w:spacing w:after="80" w:before="0" w:line="240" w:lineRule="auto"/>
+      </w:pPr>
+      <w:r>
+        <w:rPr>
+          <w:rFonts w:ascii="Calibri" w:hAnsi="Calibri"/>
+          <w:color w:val="475569"/>
+          <w:sz w:val="16"/>
+        </w:rPr>
+        <w:t>info@andromedaconsult.ru  |  andromedaconsult.ru  |  @andromedaconsult</w:t>
+      </w:r>
+    </w:p>
+    <w:p>
+      <w:pPr>
+        <w:spacing w:before="120" w:after="240"/>
+      </w:pPr>
+      <w:r>
+        <w:rPr>
+          <w:sz w:val="12"/>
+          <w:color w:val="cbd5e1"/>
+        </w:rPr>
+        <w:t>────────────────────────────────────────────────────────────────────────</w:t>
+      </w:r>
+    </w:p>
+    <w:p>
+      <w:pPr>
+        <w:spacing w:before="60" w:after="0"/>
+      </w:pPr>
     </w:p>
     <w:tbl>
       <w:tblPr>
-        <w:tblW w:type="auto" w:w="0"/>
-        <w:tblLook w:firstColumn="1" w:firstRow="1" w:lastColumn="0" w:lastRow="0" w:noHBand="0" w:noVBand="1" w:val="04A0"/>
+        <w:tblBorders>
+          <w:top w:val="single" w:sz="6" w:space="0" w:color="e5e7eb"/>
+          <w:bottom w:val="single" w:sz="6" w:space="0" w:color="e5e7eb"/>
+          <w:left w:val="single" w:sz="6" w:space="0" w:color="e5e7eb"/>
+          <w:right w:val="single" w:sz="6" w:space="0" w:color="e5e7eb"/>
+        </w:tblBorders>
       </w:tblPr>
       <w:tblGrid>
-        <w:gridCol w:w="9406"/>
+        <w:gridCol w:w="9972"/>
       </w:tblGrid>
       <w:tr>
         <w:tc>
           <w:tcPr>
-            <w:tcW w:type="dxa" w:w="9406"/>
+            <w:tcW w:type="dxa" w:w="9071"/>
+            <w:shd w:fill="f3f4f6" w:val="clear"/>
           </w:tcPr>
           <w:p>
+            <w:pPr>
+              <w:spacing w:before="140" w:after="140"/>
+            </w:pPr>
+            <w:r/>
             <w:r>
               <w:rPr>
+                <w:rFonts w:ascii="Calibri" w:hAnsi="Calibri"/>
                 <w:b/>
-                <w:sz w:val="22"/>
+                <w:color w:val="111827"/>
+                <w:sz w:val="20"/>
               </w:rPr>
               <w:t>📋 Основные реквизиты</w:t>
             </w:r>
@@ -143,43 +157,94 @@
       <w:tr>
         <w:tc>
           <w:tcPr>
-            <w:tcW w:type="dxa" w:w="9406"/>
+            <w:tcW w:type="dxa" w:w="9071"/>
           </w:tcPr>
           <w:p>
             <w:r>
               <w:br/>
-              <w:t>ИНН 2539118775  ·  ОГРН 1112539013410  ·  7 чел.</w:t>
+              <w:t>ИНН 2539118775  ·  ОГРН 1112539013410  ·  7 чел.  ·  12 лет (с 2011)</w:t>
               <w:br/>
-              <w:t>690011, г. Владивосток, ул. Енисейская, 23Б, оф. 800</w:t>
+              <w:t>📍 690011, г. Владивосток, ул. Енисейская, 23Б, оф. 800</w:t>
               <w:br/>
-              <w:t>Директор: Кялунзига Алексей Васильевич</w:t>
-              <w:br/>
-              <w:t>ОКВЭД 25.11: Производство строительных металлических конструкций</w:t>
+              <w:t>Кялунзига Алексей Васильевич</w:t>
+            </w:r>
+          </w:p>
+          <w:p>
+            <w:pPr>
+              <w:spacing w:after="60" w:before="0"/>
+            </w:pPr>
+            <w:r>
+              <w:rPr>
+                <w:rFonts w:ascii="Calibri" w:hAnsi="Calibri"/>
+                <w:b/>
+                <w:color w:val="374151"/>
+                <w:sz w:val="19"/>
+              </w:rPr>
+            </w:r>
+          </w:p>
+          <w:p>
+            <w:pPr>
+              <w:spacing w:after="60" w:before="0"/>
+            </w:pPr>
+            <w:r>
+              <w:rPr>
+                <w:rFonts w:ascii="Calibri" w:hAnsi="Calibri"/>
+                <w:color w:val="6B7280"/>
+                <w:sz w:val="18"/>
+              </w:rPr>
+            </w:r>
+          </w:p>
+          <w:p>
+            <w:pPr>
+              <w:spacing w:after="0" w:before="0"/>
+            </w:pPr>
+            <w:r>
+              <w:rPr>
+                <w:rFonts w:ascii="Calibri" w:hAnsi="Calibri"/>
+                <w:color w:val="6B7280"/>
+                <w:sz w:val="18"/>
+              </w:rPr>
             </w:r>
           </w:p>
         </w:tc>
       </w:tr>
     </w:tbl>
+    <w:p>
+      <w:pPr>
+        <w:spacing w:before="60" w:after="0"/>
+      </w:pPr>
+    </w:p>
     <w:tbl>
       <w:tblPr>
-        <w:tblW w:type="auto" w:w="0"/>
-        <w:tblLook w:firstColumn="1" w:firstRow="1" w:lastColumn="0" w:lastRow="0" w:noHBand="0" w:noVBand="1" w:val="04A0"/>
+        <w:tblBorders>
+          <w:top w:val="single" w:sz="6" w:space="0" w:color="e5e7eb"/>
+          <w:bottom w:val="single" w:sz="6" w:space="0" w:color="e5e7eb"/>
+          <w:left w:val="single" w:sz="6" w:space="0" w:color="e5e7eb"/>
+          <w:right w:val="single" w:sz="6" w:space="0" w:color="e5e7eb"/>
+        </w:tblBorders>
       </w:tblPr>
       <w:tblGrid>
-        <w:gridCol w:w="9406"/>
+        <w:gridCol w:w="9972"/>
       </w:tblGrid>
       <w:tr>
         <w:tc>
           <w:tcPr>
-            <w:tcW w:type="dxa" w:w="9406"/>
+            <w:tcW w:type="dxa" w:w="9071"/>
+            <w:shd w:fill="f3f4f6" w:val="clear"/>
           </w:tcPr>
           <w:p>
+            <w:pPr>
+              <w:spacing w:before="140" w:after="140"/>
+            </w:pPr>
+            <w:r/>
             <w:r>
               <w:rPr>
+                <w:rFonts w:ascii="Calibri" w:hAnsi="Calibri"/>
                 <w:b/>
-                <w:sz w:val="22"/>
+                <w:color w:val="111827"/>
+                <w:sz w:val="20"/>
               </w:rPr>
-              <w:t>1️⃣ Выручка по годам</w:t>
+              <w:t>1️⃣ Наша выручка по годам</w:t>
             </w:r>
           </w:p>
         </w:tc>
@@ -187,47 +252,165 @@
       <w:tr>
         <w:tc>
           <w:tcPr>
-            <w:tcW w:type="dxa" w:w="9406"/>
+            <w:tcW w:type="dxa" w:w="9071"/>
           </w:tcPr>
           <w:p>
             <w:r>
-              <w:t>2022    - млн руб.</w:t>
               <w:br/>
-              <w:t>2023    - млн руб.</w:t>
+              <w:t>2022    −</w:t>
               <w:br/>
-              <w:t>2024    ~412 млн руб.</w:t>
+              <w:t>2023    −</w:t>
               <w:br/>
-              <w:t>2025    120 млн руб.</w:t>
+              <w:t>2024    ~412 млн ₽</w:t>
+              <w:br/>
+              <w:t>2025    120 млн ₽</w:t>
               <w:br/>
               <w:br/>
-              <w:t>Суммарно: ~532 млн руб.</w:t>
+              <w:t>~120 млн ₽ (2025) — строительные металлоконструкции</w:t>
               <w:br/>
-              <w:t>Прибыль за 2025: 12,9 млн руб.</w:t>
+              <w:t>Прибыль: 12,9 млн ₽ (2025)</w:t>
+            </w:r>
+          </w:p>
+          <w:p>
+            <w:pPr>
+              <w:spacing w:after="60" w:before="0"/>
+            </w:pPr>
+            <w:r>
+              <w:rPr>
+                <w:rFonts w:ascii="Calibri" w:hAnsi="Calibri"/>
+                <w:b/>
+                <w:color w:val="2563EB"/>
+                <w:sz w:val="18"/>
+              </w:rPr>
+            </w:r>
+          </w:p>
+          <w:p>
+            <w:pPr>
+              <w:spacing w:after="60" w:before="0"/>
+            </w:pPr>
+            <w:r>
+              <w:rPr>
+                <w:rFonts w:ascii="Calibri" w:hAnsi="Calibri"/>
+                <w:b/>
+                <w:color w:val="A16207"/>
+                <w:sz w:val="18"/>
+              </w:rPr>
+            </w:r>
+          </w:p>
+          <w:p>
+            <w:pPr>
+              <w:spacing w:after="60" w:before="0"/>
+            </w:pPr>
+            <w:r>
+              <w:rPr>
+                <w:rFonts w:ascii="Calibri" w:hAnsi="Calibri"/>
+                <w:b/>
+                <w:color w:val="2563EB"/>
+                <w:sz w:val="18"/>
+              </w:rPr>
+            </w:r>
+          </w:p>
+          <w:p>
+            <w:pPr>
+              <w:spacing w:after="60" w:before="0"/>
+            </w:pPr>
+            <w:r>
+              <w:rPr>
+                <w:rFonts w:ascii="Calibri" w:hAnsi="Calibri"/>
+                <w:b/>
+                <w:color w:val="2563EB"/>
+                <w:sz w:val="18"/>
+              </w:rPr>
+            </w:r>
+          </w:p>
+          <w:tbl>
+            <w:tblPr>
+              <w:tblBorders>
+                <w:top w:val="single" w:sz="8" w:space="0" w:color="e5e7eb"/>
+                <w:bottom w:val="single" w:sz="8" w:space="0" w:color="e5e7eb"/>
+                <w:left w:val="single" w:sz="8" w:space="0" w:color="e5e7eb"/>
+                <w:right w:val="single" w:sz="8" w:space="0" w:color="e5e7eb"/>
+              </w:tblBorders>
+            </w:tblPr>
+            <w:tblGrid>
+              <w:gridCol w:w="9071"/>
+            </w:tblGrid>
+            <w:tr>
+              <w:tc>
+                <w:tcPr>
+                  <w:tcW w:type="dxa" w:w="8787"/>
+                  <w:shd w:fill="f9fafb" w:val="clear"/>
+                </w:tcPr>
+                <w:p>
+                  <w:pPr>
+                    <w:spacing w:before="120" w:after="120"/>
+                  </w:pPr>
+                  <w:r/>
+                  <w:r>
+                    <w:rPr>
+                      <w:rFonts w:ascii="Calibri" w:hAnsi="Calibri"/>
+                      <w:b/>
+                      <w:color w:val="1E293B"/>
+                      <w:sz w:val="20"/>
+                    </w:rPr>
+                    <w:t>📊 Суммарно за 2022–2025: ~1 506 млн ₽</w:t>
+                  </w:r>
+                </w:p>
+              </w:tc>
+            </w:tr>
+          </w:tbl>
+          <w:p/>
+          <w:p>
+            <w:pPr>
+              <w:spacing w:after="0" w:before="0"/>
+            </w:pPr>
+            <w:r>
+              <w:rPr>
+                <w:rFonts w:ascii="Calibri" w:hAnsi="Calibri"/>
+                <w:color w:val="9CA3AF"/>
+                <w:sz w:val="16"/>
+              </w:rPr>
             </w:r>
           </w:p>
         </w:tc>
       </w:tr>
     </w:tbl>
+    <w:p>
+      <w:pPr>
+        <w:spacing w:before="60" w:after="0"/>
+      </w:pPr>
+    </w:p>
     <w:tbl>
       <w:tblPr>
-        <w:tblW w:type="auto" w:w="0"/>
-        <w:tblLook w:firstColumn="1" w:firstRow="1" w:lastColumn="0" w:lastRow="0" w:noHBand="0" w:noVBand="1" w:val="04A0"/>
+        <w:tblBorders>
+          <w:top w:val="single" w:sz="6" w:space="0" w:color="e5e7eb"/>
+          <w:bottom w:val="single" w:sz="6" w:space="0" w:color="e5e7eb"/>
+          <w:left w:val="single" w:sz="6" w:space="0" w:color="e5e7eb"/>
+          <w:right w:val="single" w:sz="6" w:space="0" w:color="e5e7eb"/>
+        </w:tblBorders>
       </w:tblPr>
       <w:tblGrid>
-        <w:gridCol w:w="9406"/>
+        <w:gridCol w:w="9972"/>
       </w:tblGrid>
       <w:tr>
         <w:tc>
           <w:tcPr>
-            <w:tcW w:type="dxa" w:w="9406"/>
+            <w:tcW w:type="dxa" w:w="9071"/>
+            <w:shd w:fill="f3f4f6" w:val="clear"/>
           </w:tcPr>
           <w:p>
+            <w:pPr>
+              <w:spacing w:before="140" w:after="140"/>
+            </w:pPr>
+            <w:r/>
             <w:r>
               <w:rPr>
+                <w:rFonts w:ascii="Calibri" w:hAnsi="Calibri"/>
                 <w:b/>
-                <w:sz w:val="22"/>
+                <w:color w:val="111827"/>
+                <w:sz w:val="20"/>
               </w:rPr>
-              <w:t>2️⃣ Производство</w:t>
+              <w:t>2️⃣ Наше производство — что мы предполагаем</w:t>
             </w:r>
           </w:p>
         </w:tc>
@@ -235,38 +418,171 @@
       <w:tr>
         <w:tc>
           <w:tcPr>
-            <w:tcW w:type="dxa" w:w="9406"/>
+            <w:tcW w:type="dxa" w:w="9071"/>
           </w:tcPr>
           <w:p>
             <w:r>
               <w:br/>
-              <w:t>ООО «РЕГИОН» занимается производство строительных металлических конструкций во Владивостоке. Компания работает на рынке более 12 лет и изготавливает металлоконструкции для строительной отрасли. Производственные мощности расположены в г. Владивосток.</w:t>
+              <w:t>Производство строительных металлоконструкций. Компания работает более 12 лет, имеет производственную базу во Владивостоке, изготавливает металлоконструкции для строительной отрасли.</w:t>
               <w:br/>
               <w:br/>
-              <w:t>Штат составляет 7 человек.</w:t>
+              <w:t>Персонал: 7 человек.</w:t>
+              <w:br/>
+              <w:br/>
+              <w:t>Инновация: технологию производства металлоконструкций с повышенной прочностью и коррозионной стойкостью</w:t>
             </w:r>
           </w:p>
+          <w:p>
+            <w:pPr>
+              <w:spacing w:after="60" w:before="0"/>
+            </w:pPr>
+            <w:r>
+              <w:rPr>
+                <w:rFonts w:ascii="Calibri" w:hAnsi="Calibri"/>
+                <w:color w:val="374151"/>
+                <w:sz w:val="19"/>
+              </w:rPr>
+            </w:r>
+          </w:p>
+          <w:p>
+            <w:pPr>
+              <w:spacing w:after="60" w:before="0"/>
+            </w:pPr>
+            <w:r>
+              <w:rPr>
+                <w:rFonts w:ascii="Calibri" w:hAnsi="Calibri"/>
+                <w:b/>
+                <w:color w:val="374151"/>
+                <w:sz w:val="19"/>
+              </w:rPr>
+            </w:r>
+          </w:p>
+          <w:p>
+            <w:pPr>
+              <w:pStyle w:val="ListNumber"/>
+              <w:spacing w:after="20" w:before="0"/>
+            </w:pPr>
+            <w:r>
+              <w:rPr>
+                <w:rFonts w:ascii="Calibri" w:hAnsi="Calibri"/>
+                <w:color w:val="374151"/>
+                <w:sz w:val="20"/>
+              </w:rPr>
+            </w:r>
+          </w:p>
+          <w:p>
+            <w:pPr>
+              <w:pStyle w:val="ListNumber"/>
+              <w:spacing w:after="20" w:before="0"/>
+            </w:pPr>
+            <w:r>
+              <w:rPr>
+                <w:rFonts w:ascii="Calibri" w:hAnsi="Calibri"/>
+                <w:color w:val="374151"/>
+                <w:sz w:val="20"/>
+              </w:rPr>
+            </w:r>
+          </w:p>
+          <w:p>
+            <w:pPr>
+              <w:pStyle w:val="ListNumber"/>
+              <w:spacing w:after="20" w:before="0"/>
+            </w:pPr>
+            <w:r>
+              <w:rPr>
+                <w:rFonts w:ascii="Calibri" w:hAnsi="Calibri"/>
+                <w:color w:val="374151"/>
+                <w:sz w:val="20"/>
+              </w:rPr>
+            </w:r>
+          </w:p>
+          <w:p>
+            <w:pPr>
+              <w:pStyle w:val="ListNumber"/>
+              <w:spacing w:after="20" w:before="0"/>
+            </w:pPr>
+            <w:r>
+              <w:rPr>
+                <w:rFonts w:ascii="Calibri" w:hAnsi="Calibri"/>
+                <w:color w:val="374151"/>
+                <w:sz w:val="20"/>
+              </w:rPr>
+            </w:r>
+          </w:p>
+          <w:tbl>
+            <w:tblPr>
+              <w:tblBorders>
+                <w:top w:val="single" w:sz="8" w:space="0" w:color="fde68a"/>
+                <w:bottom w:val="single" w:sz="8" w:space="0" w:color="fde68a"/>
+                <w:left w:val="single" w:sz="8" w:space="0" w:color="fde68a"/>
+                <w:right w:val="single" w:sz="8" w:space="0" w:color="fde68a"/>
+              </w:tblBorders>
+            </w:tblPr>
+            <w:tblGrid>
+              <w:gridCol w:w="9071"/>
+            </w:tblGrid>
+            <w:tr>
+              <w:tc>
+                <w:tcPr>
+                  <w:tcW w:type="dxa" w:w="8787"/>
+                  <w:shd w:fill="fefce8" w:val="clear"/>
+                </w:tcPr>
+                <w:p>
+                  <w:pPr>
+                    <w:spacing w:before="120" w:after="120"/>
+                  </w:pPr>
+                  <w:r/>
+                  <w:r>
+                    <w:rPr>
+                      <w:rFonts w:ascii="Calibri" w:hAnsi="Calibri"/>
+                      <w:b/>
+                      <w:color w:val="A16207"/>
+                      <w:sz w:val="18"/>
+                    </w:rPr>
+                    <w:t>⚠️ Для точного определения продукта-инновации нужно согласовать с вами — что именно мы производим, в чём может заключаться инновация.</w:t>
+                  </w:r>
+                </w:p>
+              </w:tc>
+            </w:tr>
+          </w:tbl>
+          <w:p/>
         </w:tc>
       </w:tr>
     </w:tbl>
+    <w:p>
+      <w:pPr>
+        <w:spacing w:before="60" w:after="0"/>
+      </w:pPr>
+    </w:p>
     <w:tbl>
       <w:tblPr>
-        <w:tblW w:type="auto" w:w="0"/>
-        <w:tblLook w:firstColumn="1" w:firstRow="1" w:lastColumn="0" w:lastRow="0" w:noHBand="0" w:noVBand="1" w:val="04A0"/>
+        <w:tblBorders>
+          <w:top w:val="single" w:sz="6" w:space="0" w:color="e5e7eb"/>
+          <w:bottom w:val="single" w:sz="6" w:space="0" w:color="e5e7eb"/>
+          <w:left w:val="single" w:sz="6" w:space="0" w:color="e5e7eb"/>
+          <w:right w:val="single" w:sz="6" w:space="0" w:color="e5e7eb"/>
+        </w:tblBorders>
       </w:tblPr>
       <w:tblGrid>
-        <w:gridCol w:w="9406"/>
+        <w:gridCol w:w="9972"/>
       </w:tblGrid>
       <w:tr>
         <w:tc>
           <w:tcPr>
-            <w:tcW w:type="dxa" w:w="9406"/>
+            <w:tcW w:type="dxa" w:w="9071"/>
+            <w:shd w:fill="f3f4f6" w:val="clear"/>
           </w:tcPr>
           <w:p>
+            <w:pPr>
+              <w:spacing w:before="140" w:after="140"/>
+            </w:pPr>
+            <w:r/>
             <w:r>
               <w:rPr>
+                <w:rFonts w:ascii="Calibri" w:hAnsi="Calibri"/>
                 <w:b/>
-                <w:sz w:val="22"/>
+                <w:color w:val="111827"/>
+                <w:sz w:val="20"/>
               </w:rPr>
               <w:t>3️⃣ Расчёт налоговой экономии при статусе резидента Сколково</w:t>
             </w:r>
@@ -276,74 +592,1175 @@
       <w:tr>
         <w:tc>
           <w:tcPr>
-            <w:tcW w:type="dxa" w:w="9406"/>
+            <w:tcW w:type="dxa" w:w="9071"/>
           </w:tcPr>
           <w:p>
             <w:r>
+              <w:br/>
               <w:t>Статус резидента Сколково даёт следующие льготы:</w:t>
               <w:br/>
-              <w:t>• Налог на прибыль — 0% (вместо 20%)</w:t>
+              <w:t>Налог на прибыль — 0% вместо 20%</w:t>
               <w:br/>
-              <w:t>• Страховые взносы — 15% с порога 1,5×МРОТ (вместо 30%)</w:t>
+              <w:t>Страховые взносы — 15% с порога 1,5×МРОТ (вместо 30%)</w:t>
               <w:br/>
-              <w:t>• Налог на имущество — 0%</w:t>
+              <w:t>Налог на имущество — 0%</w:t>
               <w:br/>
-              <w:t>• Льготы по НДС и таможенным платежам</w:t>
+              <w:t>Льготы по НДС и таможенным платежам</w:t>
               <w:br/>
               <w:br/>
-              <w:t>Предварительный расчёт экономии для ООО «РЕГИОН»:</w:t>
+              <w:t>Предварительный расчёт экономии:</w:t>
               <w:br/>
               <w:br/>
-              <w:t>❶ Налог на прибыль (0% vs 20%)</w:t>
+              <w:t>❶ Налог на прибыль (0% vs 20%) — экономия за счёт ставки 0%</w:t>
               <w:br/>
-              <w:t xml:space="preserve">  Прибыль за 2025: 12,9 млн руб.</w:t>
-              <w:br/>
-              <w:t xml:space="preserve">  Экономия: ~3 млн руб. в год</w:t>
-              <w:br/>
-              <w:br/>
-              <w:t>❷ Страховые взносы (15% вместо 30%)</w:t>
-              <w:br/>
-              <w:t xml:space="preserve">  Экономия за счёт пониженного тарифа на ФОТ свыше 1,5×МРОТ</w:t>
-              <w:br/>
+              <w:t>❷ Страховые взносы (15% вместо 30%) — экономия за счёт пониженного тарифа</w:t>
               <w:br/>
               <w:t>❸ Налог на имущество — 0%</w:t>
               <w:br/>
-              <w:t xml:space="preserve">  Зависит от состава основных средств</w:t>
               <w:br/>
+              <w:t>Прогноз экономии:</w:t>
               <w:br/>
-              <w:t>Прогноз суммарной экономии:</w:t>
+              <w:t>~3 млн ₽ (в год)</w:t>
               <w:br/>
-              <w:t>• В год: ~3 млн руб.</w:t>
+              <w:t>~12 млн ₽ (за 4 года)</w:t>
               <w:br/>
-              <w:t>• За 4 года: ~12 млн руб.</w:t>
-              <w:br/>
-              <w:t>• За 10 лет: ~30 млн руб.</w:t>
+              <w:t>~30 млн ₽ (за 10 лет)</w:t>
               <w:br/>
               <w:br/>
               <w:t>Окупаемость услуг: 3–6 месяцев</w:t>
             </w:r>
           </w:p>
+          <w:p>
+            <w:pPr>
+              <w:spacing w:after="60" w:before="0"/>
+            </w:pPr>
+            <w:r>
+              <w:rPr>
+                <w:rFonts w:ascii="Calibri" w:hAnsi="Calibri"/>
+                <w:color w:val="374151"/>
+                <w:sz w:val="19"/>
+              </w:rPr>
+            </w:r>
+          </w:p>
+          <w:p>
+            <w:pPr>
+              <w:pStyle w:val="ListBullet"/>
+              <w:spacing w:after="20" w:before="0"/>
+            </w:pPr>
+            <w:r>
+              <w:rPr>
+                <w:rFonts w:ascii="Calibri" w:hAnsi="Calibri"/>
+                <w:color w:val="374151"/>
+                <w:sz w:val="20"/>
+              </w:rPr>
+            </w:r>
+          </w:p>
+          <w:p>
+            <w:pPr>
+              <w:pStyle w:val="ListBullet"/>
+              <w:spacing w:after="20" w:before="0"/>
+            </w:pPr>
+            <w:r>
+              <w:rPr>
+                <w:rFonts w:ascii="Calibri" w:hAnsi="Calibri"/>
+                <w:color w:val="374151"/>
+                <w:sz w:val="20"/>
+              </w:rPr>
+            </w:r>
+          </w:p>
+          <w:p>
+            <w:pPr>
+              <w:pStyle w:val="ListBullet"/>
+              <w:spacing w:after="20" w:before="0"/>
+            </w:pPr>
+            <w:r>
+              <w:rPr>
+                <w:rFonts w:ascii="Calibri" w:hAnsi="Calibri"/>
+                <w:color w:val="374151"/>
+                <w:sz w:val="20"/>
+              </w:rPr>
+            </w:r>
+          </w:p>
+          <w:p>
+            <w:pPr>
+              <w:pStyle w:val="ListBullet"/>
+              <w:spacing w:after="20" w:before="0"/>
+            </w:pPr>
+            <w:r>
+              <w:rPr>
+                <w:rFonts w:ascii="Calibri" w:hAnsi="Calibri"/>
+                <w:color w:val="374151"/>
+                <w:sz w:val="20"/>
+              </w:rPr>
+            </w:r>
+          </w:p>
+          <w:tbl>
+            <w:tblPr>
+              <w:tblW w:type="auto" w:w="0"/>
+              <w:jc w:val="center"/>
+              <w:tblLook w:firstColumn="1" w:firstRow="1" w:lastColumn="0" w:lastRow="0" w:noHBand="0" w:noVBand="1" w:val="04A0"/>
+              <w:tblBorders>
+                <w:top w:val="single" w:sz="4" w:space="0" w:color="d1d5db"/>
+                <w:bottom w:val="single" w:sz="4" w:space="0" w:color="d1d5db"/>
+                <w:left w:val="single" w:sz="4" w:space="0" w:color="d1d5db"/>
+                <w:right w:val="single" w:sz="4" w:space="0" w:color="d1d5db"/>
+                <w:insideH w:val="single" w:sz="4" w:space="0" w:color="d1d5db"/>
+                <w:insideV w:val="single" w:sz="4" w:space="0" w:color="d1d5db"/>
+              </w:tblBorders>
+            </w:tblPr>
+            <w:tblGrid>
+              <w:gridCol w:w="1512"/>
+              <w:gridCol w:w="1512"/>
+              <w:gridCol w:w="1512"/>
+              <w:gridCol w:w="1512"/>
+              <w:gridCol w:w="1512"/>
+              <w:gridCol w:w="1512"/>
+            </w:tblGrid>
+            <w:tr>
+              <w:tc>
+                <w:tcPr>
+                  <w:tcW w:type="dxa" w:w="2381"/>
+                  <w:shd w:fill="f9fafb" w:val="clear"/>
+                </w:tcPr>
+                <w:p>
+                  <w:pPr>
+                    <w:spacing w:before="60" w:after="60"/>
+                  </w:pPr>
+                  <w:r/>
+                  <w:r>
+                    <w:rPr>
+                      <w:rFonts w:ascii="Calibri" w:hAnsi="Calibri"/>
+                      <w:b/>
+                      <w:color w:val="374151"/>
+                      <w:sz w:val="17"/>
+                    </w:rPr>
+                    <w:t>Показатель</w:t>
+                  </w:r>
+                </w:p>
+              </w:tc>
+              <w:tc>
+                <w:tcPr>
+                  <w:tcW w:type="dxa" w:w="1020"/>
+                  <w:shd w:fill="f9fafb" w:val="clear"/>
+                </w:tcPr>
+                <w:p>
+                  <w:pPr>
+                    <w:spacing w:before="60" w:after="60"/>
+                  </w:pPr>
+                  <w:r/>
+                  <w:r>
+                    <w:rPr>
+                      <w:rFonts w:ascii="Calibri" w:hAnsi="Calibri"/>
+                      <w:b/>
+                      <w:color w:val="374151"/>
+                      <w:sz w:val="17"/>
+                    </w:rPr>
+                    <w:t>2022</w:t>
+                  </w:r>
+                </w:p>
+              </w:tc>
+              <w:tc>
+                <w:tcPr>
+                  <w:tcW w:type="dxa" w:w="1020"/>
+                  <w:shd w:fill="f9fafb" w:val="clear"/>
+                </w:tcPr>
+                <w:p>
+                  <w:pPr>
+                    <w:spacing w:before="60" w:after="60"/>
+                  </w:pPr>
+                  <w:r/>
+                  <w:r>
+                    <w:rPr>
+                      <w:rFonts w:ascii="Calibri" w:hAnsi="Calibri"/>
+                      <w:b/>
+                      <w:color w:val="374151"/>
+                      <w:sz w:val="17"/>
+                    </w:rPr>
+                    <w:t>2023 *</w:t>
+                  </w:r>
+                </w:p>
+              </w:tc>
+              <w:tc>
+                <w:tcPr>
+                  <w:tcW w:type="dxa" w:w="1020"/>
+                  <w:shd w:fill="f9fafb" w:val="clear"/>
+                </w:tcPr>
+                <w:p>
+                  <w:pPr>
+                    <w:spacing w:before="60" w:after="60"/>
+                  </w:pPr>
+                  <w:r/>
+                  <w:r>
+                    <w:rPr>
+                      <w:rFonts w:ascii="Calibri" w:hAnsi="Calibri"/>
+                      <w:b/>
+                      <w:color w:val="374151"/>
+                      <w:sz w:val="17"/>
+                    </w:rPr>
+                    <w:t>2024</w:t>
+                  </w:r>
+                </w:p>
+              </w:tc>
+              <w:tc>
+                <w:tcPr>
+                  <w:tcW w:type="dxa" w:w="1020"/>
+                  <w:shd w:fill="f9fafb" w:val="clear"/>
+                </w:tcPr>
+                <w:p>
+                  <w:pPr>
+                    <w:spacing w:before="60" w:after="60"/>
+                  </w:pPr>
+                  <w:r/>
+                  <w:r>
+                    <w:rPr>
+                      <w:rFonts w:ascii="Calibri" w:hAnsi="Calibri"/>
+                      <w:b/>
+                      <w:color w:val="374151"/>
+                      <w:sz w:val="17"/>
+                    </w:rPr>
+                    <w:t>2025</w:t>
+                  </w:r>
+                </w:p>
+              </w:tc>
+              <w:tc>
+                <w:tcPr>
+                  <w:tcW w:type="dxa" w:w="1417"/>
+                  <w:shd w:fill="f9fafb" w:val="clear"/>
+                </w:tcPr>
+                <w:p>
+                  <w:pPr>
+                    <w:spacing w:before="60" w:after="60"/>
+                  </w:pPr>
+                  <w:r/>
+                  <w:r>
+                    <w:rPr>
+                      <w:rFonts w:ascii="Calibri" w:hAnsi="Calibri"/>
+                      <w:b/>
+                      <w:color w:val="374151"/>
+                      <w:sz w:val="17"/>
+                    </w:rPr>
+                    <w:t>За 4 года</w:t>
+                  </w:r>
+                </w:p>
+              </w:tc>
+            </w:tr>
+            <w:tr>
+              <w:tc>
+                <w:tcPr>
+                  <w:tcW w:type="dxa" w:w="2381"/>
+                </w:tcPr>
+                <w:p>
+                  <w:pPr>
+                    <w:spacing w:before="60" w:after="60"/>
+                  </w:pPr>
+                  <w:r/>
+                  <w:r>
+                    <w:rPr>
+                      <w:rFonts w:ascii="Calibri" w:hAnsi="Calibri"/>
+                      <w:b/>
+                      <w:color w:val="374151"/>
+                      <w:sz w:val="17"/>
+                    </w:rPr>
+                    <w:t>Выручка</w:t>
+                  </w:r>
+                </w:p>
+              </w:tc>
+              <w:tc>
+                <w:tcPr>
+                  <w:tcW w:type="dxa" w:w="1020"/>
+                </w:tcPr>
+                <w:p>
+                  <w:pPr>
+                    <w:spacing w:before="60" w:after="60"/>
+                    <w:jc w:val="right"/>
+                  </w:pPr>
+                  <w:r/>
+                  <w:r>
+                    <w:rPr>
+                      <w:rFonts w:ascii="Calibri" w:hAnsi="Calibri"/>
+                      <w:color w:val="374151"/>
+                      <w:sz w:val="17"/>
+                    </w:rPr>
+                    <w:t>276,1 млн</w:t>
+                  </w:r>
+                </w:p>
+              </w:tc>
+              <w:tc>
+                <w:tcPr>
+                  <w:tcW w:type="dxa" w:w="1020"/>
+                </w:tcPr>
+                <w:p>
+                  <w:pPr>
+                    <w:spacing w:before="60" w:after="60"/>
+                    <w:jc w:val="right"/>
+                  </w:pPr>
+                  <w:r/>
+                  <w:r>
+                    <w:rPr>
+                      <w:rFonts w:ascii="Calibri" w:hAnsi="Calibri"/>
+                      <w:color w:val="374151"/>
+                      <w:sz w:val="17"/>
+                    </w:rPr>
+                    <w:t>~400 млн</w:t>
+                  </w:r>
+                </w:p>
+              </w:tc>
+              <w:tc>
+                <w:tcPr>
+                  <w:tcW w:type="dxa" w:w="1020"/>
+                </w:tcPr>
+                <w:p>
+                  <w:pPr>
+                    <w:spacing w:before="60" w:after="60"/>
+                    <w:jc w:val="right"/>
+                  </w:pPr>
+                  <w:r/>
+                  <w:r>
+                    <w:rPr>
+                      <w:rFonts w:ascii="Calibri" w:hAnsi="Calibri"/>
+                      <w:color w:val="374151"/>
+                      <w:sz w:val="17"/>
+                    </w:rPr>
+                    <w:t>505,9 млн</w:t>
+                  </w:r>
+                </w:p>
+              </w:tc>
+              <w:tc>
+                <w:tcPr>
+                  <w:tcW w:type="dxa" w:w="1020"/>
+                </w:tcPr>
+                <w:p>
+                  <w:pPr>
+                    <w:spacing w:before="60" w:after="60"/>
+                    <w:jc w:val="right"/>
+                  </w:pPr>
+                  <w:r/>
+                  <w:r>
+                    <w:rPr>
+                      <w:rFonts w:ascii="Calibri" w:hAnsi="Calibri"/>
+                      <w:color w:val="374151"/>
+                      <w:sz w:val="17"/>
+                    </w:rPr>
+                    <w:t>324,5 млн</w:t>
+                  </w:r>
+                </w:p>
+              </w:tc>
+              <w:tc>
+                <w:tcPr>
+                  <w:tcW w:type="dxa" w:w="1417"/>
+                </w:tcPr>
+                <w:p>
+                  <w:pPr>
+                    <w:spacing w:before="60" w:after="60"/>
+                    <w:jc w:val="right"/>
+                  </w:pPr>
+                  <w:r/>
+                  <w:r>
+                    <w:rPr>
+                      <w:rFonts w:ascii="Calibri" w:hAnsi="Calibri"/>
+                      <w:b/>
+                      <w:color w:val="374151"/>
+                      <w:sz w:val="17"/>
+                    </w:rPr>
+                    <w:t>~1 506 млн</w:t>
+                  </w:r>
+                </w:p>
+              </w:tc>
+            </w:tr>
+            <w:tr>
+              <w:tc>
+                <w:tcPr>
+                  <w:tcW w:type="dxa" w:w="2381"/>
+                  <w:shd w:fill="f9fafb" w:val="clear"/>
+                </w:tcPr>
+                <w:p>
+                  <w:pPr>
+                    <w:spacing w:before="60" w:after="60"/>
+                  </w:pPr>
+                  <w:r/>
+                  <w:r>
+                    <w:rPr>
+                      <w:rFonts w:ascii="Calibri" w:hAnsi="Calibri"/>
+                      <w:b/>
+                      <w:color w:val="374151"/>
+                      <w:sz w:val="17"/>
+                    </w:rPr>
+                    <w:t>Прибыль до налогообложения</w:t>
+                  </w:r>
+                </w:p>
+              </w:tc>
+              <w:tc>
+                <w:tcPr>
+                  <w:tcW w:type="dxa" w:w="1020"/>
+                  <w:shd w:fill="f9fafb" w:val="clear"/>
+                </w:tcPr>
+                <w:p>
+                  <w:pPr>
+                    <w:spacing w:before="60" w:after="60"/>
+                    <w:jc w:val="right"/>
+                  </w:pPr>
+                  <w:r/>
+                  <w:r>
+                    <w:rPr>
+                      <w:rFonts w:ascii="Calibri" w:hAnsi="Calibri"/>
+                      <w:color w:val="374151"/>
+                      <w:sz w:val="17"/>
+                    </w:rPr>
+                    <w:t>~75 млн</w:t>
+                  </w:r>
+                </w:p>
+              </w:tc>
+              <w:tc>
+                <w:tcPr>
+                  <w:tcW w:type="dxa" w:w="1020"/>
+                  <w:shd w:fill="f9fafb" w:val="clear"/>
+                </w:tcPr>
+                <w:p>
+                  <w:pPr>
+                    <w:spacing w:before="60" w:after="60"/>
+                    <w:jc w:val="right"/>
+                  </w:pPr>
+                  <w:r/>
+                  <w:r>
+                    <w:rPr>
+                      <w:rFonts w:ascii="Calibri" w:hAnsi="Calibri"/>
+                      <w:color w:val="374151"/>
+                      <w:sz w:val="17"/>
+                    </w:rPr>
+                    <w:t>~141 млн</w:t>
+                  </w:r>
+                </w:p>
+              </w:tc>
+              <w:tc>
+                <w:tcPr>
+                  <w:tcW w:type="dxa" w:w="1020"/>
+                  <w:shd w:fill="f9fafb" w:val="clear"/>
+                </w:tcPr>
+                <w:p>
+                  <w:pPr>
+                    <w:spacing w:before="60" w:after="60"/>
+                    <w:jc w:val="right"/>
+                  </w:pPr>
+                  <w:r/>
+                  <w:r>
+                    <w:rPr>
+                      <w:rFonts w:ascii="Calibri" w:hAnsi="Calibri"/>
+                      <w:color w:val="374151"/>
+                      <w:sz w:val="17"/>
+                    </w:rPr>
+                    <w:t>91,6 млн</w:t>
+                  </w:r>
+                </w:p>
+              </w:tc>
+              <w:tc>
+                <w:tcPr>
+                  <w:tcW w:type="dxa" w:w="1020"/>
+                  <w:shd w:fill="f9fafb" w:val="clear"/>
+                </w:tcPr>
+                <w:p>
+                  <w:pPr>
+                    <w:spacing w:before="60" w:after="60"/>
+                    <w:jc w:val="right"/>
+                  </w:pPr>
+                  <w:r/>
+                  <w:r>
+                    <w:rPr>
+                      <w:rFonts w:ascii="Calibri" w:hAnsi="Calibri"/>
+                      <w:color w:val="DC2626"/>
+                      <w:sz w:val="17"/>
+                    </w:rPr>
+                    <w:t>−29,2 млн</w:t>
+                  </w:r>
+                </w:p>
+              </w:tc>
+              <w:tc>
+                <w:tcPr>
+                  <w:tcW w:type="dxa" w:w="1417"/>
+                  <w:shd w:fill="f9fafb" w:val="clear"/>
+                </w:tcPr>
+                <w:p>
+                  <w:pPr>
+                    <w:spacing w:before="60" w:after="60"/>
+                    <w:jc w:val="right"/>
+                  </w:pPr>
+                  <w:r/>
+                  <w:r>
+                    <w:rPr>
+                      <w:rFonts w:ascii="Calibri" w:hAnsi="Calibri"/>
+                      <w:b/>
+                      <w:color w:val="374151"/>
+                      <w:sz w:val="17"/>
+                    </w:rPr>
+                    <w:t>~278 млн</w:t>
+                  </w:r>
+                </w:p>
+              </w:tc>
+            </w:tr>
+            <w:tr>
+              <w:tc>
+                <w:tcPr>
+                  <w:tcW w:type="dxa" w:w="2381"/>
+                </w:tcPr>
+                <w:p>
+                  <w:pPr>
+                    <w:spacing w:before="60" w:after="60"/>
+                  </w:pPr>
+                  <w:r/>
+                  <w:r>
+                    <w:rPr>
+                      <w:rFonts w:ascii="Calibri" w:hAnsi="Calibri"/>
+                      <w:color w:val="2563EB"/>
+                      <w:sz w:val="17"/>
+                    </w:rPr>
+                    <w:t>Экономия: налог на прибыль (0%)</w:t>
+                  </w:r>
+                </w:p>
+              </w:tc>
+              <w:tc>
+                <w:tcPr>
+                  <w:tcW w:type="dxa" w:w="1020"/>
+                  <w:shd w:fill="eff6ff" w:val="clear"/>
+                </w:tcPr>
+                <w:p>
+                  <w:pPr>
+                    <w:spacing w:before="60" w:after="60"/>
+                    <w:jc w:val="right"/>
+                  </w:pPr>
+                  <w:r/>
+                  <w:r>
+                    <w:rPr>
+                      <w:rFonts w:ascii="Calibri" w:hAnsi="Calibri"/>
+                      <w:color w:val="2563EB"/>
+                      <w:sz w:val="17"/>
+                    </w:rPr>
+                    <w:t>~15 млн</w:t>
+                  </w:r>
+                </w:p>
+              </w:tc>
+              <w:tc>
+                <w:tcPr>
+                  <w:tcW w:type="dxa" w:w="1020"/>
+                  <w:shd w:fill="eff6ff" w:val="clear"/>
+                </w:tcPr>
+                <w:p>
+                  <w:pPr>
+                    <w:spacing w:before="60" w:after="60"/>
+                    <w:jc w:val="right"/>
+                  </w:pPr>
+                  <w:r/>
+                  <w:r>
+                    <w:rPr>
+                      <w:rFonts w:ascii="Calibri" w:hAnsi="Calibri"/>
+                      <w:color w:val="2563EB"/>
+                      <w:sz w:val="17"/>
+                    </w:rPr>
+                    <w:t>~28 млн</w:t>
+                  </w:r>
+                </w:p>
+              </w:tc>
+              <w:tc>
+                <w:tcPr>
+                  <w:tcW w:type="dxa" w:w="1020"/>
+                  <w:shd w:fill="eff6ff" w:val="clear"/>
+                </w:tcPr>
+                <w:p>
+                  <w:pPr>
+                    <w:spacing w:before="60" w:after="60"/>
+                    <w:jc w:val="right"/>
+                  </w:pPr>
+                  <w:r/>
+                  <w:r>
+                    <w:rPr>
+                      <w:rFonts w:ascii="Calibri" w:hAnsi="Calibri"/>
+                      <w:color w:val="2563EB"/>
+                      <w:sz w:val="17"/>
+                    </w:rPr>
+                    <w:t>~18,3 млн</w:t>
+                  </w:r>
+                </w:p>
+              </w:tc>
+              <w:tc>
+                <w:tcPr>
+                  <w:tcW w:type="dxa" w:w="1020"/>
+                  <w:shd w:fill="eff6ff" w:val="clear"/>
+                </w:tcPr>
+                <w:p>
+                  <w:pPr>
+                    <w:spacing w:before="60" w:after="60"/>
+                    <w:jc w:val="right"/>
+                  </w:pPr>
+                  <w:r/>
+                  <w:r>
+                    <w:rPr>
+                      <w:rFonts w:ascii="Calibri" w:hAnsi="Calibri"/>
+                      <w:color w:val="9CA3AF"/>
+                      <w:sz w:val="17"/>
+                    </w:rPr>
+                    <w:t>0</w:t>
+                  </w:r>
+                </w:p>
+              </w:tc>
+              <w:tc>
+                <w:tcPr>
+                  <w:tcW w:type="dxa" w:w="1417"/>
+                  <w:shd w:fill="eff6ff" w:val="clear"/>
+                </w:tcPr>
+                <w:p>
+                  <w:pPr>
+                    <w:spacing w:before="60" w:after="60"/>
+                    <w:jc w:val="right"/>
+                  </w:pPr>
+                  <w:r/>
+                  <w:r>
+                    <w:rPr>
+                      <w:rFonts w:ascii="Calibri" w:hAnsi="Calibri"/>
+                      <w:b/>
+                      <w:color w:val="2563EB"/>
+                      <w:sz w:val="17"/>
+                    </w:rPr>
+                    <w:t>~61,3 млн</w:t>
+                  </w:r>
+                </w:p>
+              </w:tc>
+            </w:tr>
+            <w:tr>
+              <w:tc>
+                <w:tcPr>
+                  <w:tcW w:type="dxa" w:w="2381"/>
+                  <w:shd w:fill="f9fafb" w:val="clear"/>
+                </w:tcPr>
+                <w:p>
+                  <w:pPr>
+                    <w:spacing w:before="60" w:after="60"/>
+                  </w:pPr>
+                  <w:r/>
+                  <w:r>
+                    <w:rPr>
+                      <w:rFonts w:ascii="Calibri" w:hAnsi="Calibri"/>
+                      <w:b/>
+                      <w:color w:val="374151"/>
+                      <w:sz w:val="17"/>
+                    </w:rPr>
+                    <w:t>ФОТ (оценка)</w:t>
+                  </w:r>
+                </w:p>
+              </w:tc>
+              <w:tc>
+                <w:tcPr>
+                  <w:tcW w:type="dxa" w:w="1020"/>
+                  <w:shd w:fill="f9fafb" w:val="clear"/>
+                </w:tcPr>
+                <w:p>
+                  <w:pPr>
+                    <w:spacing w:before="60" w:after="60"/>
+                    <w:jc w:val="right"/>
+                  </w:pPr>
+                  <w:r/>
+                  <w:r>
+                    <w:rPr>
+                      <w:rFonts w:ascii="Calibri" w:hAnsi="Calibri"/>
+                      <w:color w:val="374151"/>
+                      <w:sz w:val="17"/>
+                    </w:rPr>
+                    <w:t>~80 млн</w:t>
+                  </w:r>
+                </w:p>
+              </w:tc>
+              <w:tc>
+                <w:tcPr>
+                  <w:tcW w:type="dxa" w:w="1020"/>
+                  <w:shd w:fill="f9fafb" w:val="clear"/>
+                </w:tcPr>
+                <w:p>
+                  <w:pPr>
+                    <w:spacing w:before="60" w:after="60"/>
+                    <w:jc w:val="right"/>
+                  </w:pPr>
+                  <w:r/>
+                  <w:r>
+                    <w:rPr>
+                      <w:rFonts w:ascii="Calibri" w:hAnsi="Calibri"/>
+                      <w:color w:val="374151"/>
+                      <w:sz w:val="17"/>
+                    </w:rPr>
+                    <w:t>~100 млн</w:t>
+                  </w:r>
+                </w:p>
+              </w:tc>
+              <w:tc>
+                <w:tcPr>
+                  <w:tcW w:type="dxa" w:w="1020"/>
+                  <w:shd w:fill="f9fafb" w:val="clear"/>
+                </w:tcPr>
+                <w:p>
+                  <w:pPr>
+                    <w:spacing w:before="60" w:after="60"/>
+                    <w:jc w:val="right"/>
+                  </w:pPr>
+                  <w:r/>
+                  <w:r>
+                    <w:rPr>
+                      <w:rFonts w:ascii="Calibri" w:hAnsi="Calibri"/>
+                      <w:color w:val="374151"/>
+                      <w:sz w:val="17"/>
+                    </w:rPr>
+                    <w:t>~120 млн</w:t>
+                  </w:r>
+                </w:p>
+              </w:tc>
+              <w:tc>
+                <w:tcPr>
+                  <w:tcW w:type="dxa" w:w="1020"/>
+                  <w:shd w:fill="f9fafb" w:val="clear"/>
+                </w:tcPr>
+                <w:p>
+                  <w:pPr>
+                    <w:spacing w:before="60" w:after="60"/>
+                    <w:jc w:val="right"/>
+                  </w:pPr>
+                  <w:r/>
+                  <w:r>
+                    <w:rPr>
+                      <w:rFonts w:ascii="Calibri" w:hAnsi="Calibri"/>
+                      <w:color w:val="374151"/>
+                      <w:sz w:val="17"/>
+                    </w:rPr>
+                    <w:t>~125 млн</w:t>
+                  </w:r>
+                </w:p>
+              </w:tc>
+              <w:tc>
+                <w:tcPr>
+                  <w:tcW w:type="dxa" w:w="1417"/>
+                  <w:shd w:fill="f9fafb" w:val="clear"/>
+                </w:tcPr>
+                <w:p>
+                  <w:pPr>
+                    <w:spacing w:before="60" w:after="60"/>
+                    <w:jc w:val="right"/>
+                  </w:pPr>
+                  <w:r/>
+                  <w:r>
+                    <w:rPr>
+                      <w:rFonts w:ascii="Calibri" w:hAnsi="Calibri"/>
+                      <w:b/>
+                      <w:color w:val="374151"/>
+                      <w:sz w:val="17"/>
+                    </w:rPr>
+                    <w:t>~425 млн</w:t>
+                  </w:r>
+                </w:p>
+              </w:tc>
+            </w:tr>
+            <w:tr>
+              <w:tc>
+                <w:tcPr>
+                  <w:tcW w:type="dxa" w:w="2381"/>
+                </w:tcPr>
+                <w:p>
+                  <w:pPr>
+                    <w:spacing w:before="60" w:after="60"/>
+                  </w:pPr>
+                  <w:r/>
+                  <w:r>
+                    <w:rPr>
+                      <w:rFonts w:ascii="Calibri" w:hAnsi="Calibri"/>
+                      <w:color w:val="6D28D9"/>
+                      <w:sz w:val="17"/>
+                    </w:rPr>
+                    <w:t>Экономия: страховые взносы (15%)</w:t>
+                  </w:r>
+                </w:p>
+              </w:tc>
+              <w:tc>
+                <w:tcPr>
+                  <w:tcW w:type="dxa" w:w="1020"/>
+                  <w:shd w:fill="f5f3ff" w:val="clear"/>
+                </w:tcPr>
+                <w:p>
+                  <w:pPr>
+                    <w:spacing w:before="60" w:after="60"/>
+                    <w:jc w:val="right"/>
+                  </w:pPr>
+                  <w:r/>
+                  <w:r>
+                    <w:rPr>
+                      <w:rFonts w:ascii="Calibri" w:hAnsi="Calibri"/>
+                      <w:color w:val="6D28D9"/>
+                      <w:sz w:val="17"/>
+                    </w:rPr>
+                    <w:t>~12 млн</w:t>
+                  </w:r>
+                </w:p>
+              </w:tc>
+              <w:tc>
+                <w:tcPr>
+                  <w:tcW w:type="dxa" w:w="1020"/>
+                  <w:shd w:fill="f5f3ff" w:val="clear"/>
+                </w:tcPr>
+                <w:p>
+                  <w:pPr>
+                    <w:spacing w:before="60" w:after="60"/>
+                    <w:jc w:val="right"/>
+                  </w:pPr>
+                  <w:r/>
+                  <w:r>
+                    <w:rPr>
+                      <w:rFonts w:ascii="Calibri" w:hAnsi="Calibri"/>
+                      <w:color w:val="6D28D9"/>
+                      <w:sz w:val="17"/>
+                    </w:rPr>
+                    <w:t>~15 млн</w:t>
+                  </w:r>
+                </w:p>
+              </w:tc>
+              <w:tc>
+                <w:tcPr>
+                  <w:tcW w:type="dxa" w:w="1020"/>
+                  <w:shd w:fill="f5f3ff" w:val="clear"/>
+                </w:tcPr>
+                <w:p>
+                  <w:pPr>
+                    <w:spacing w:before="60" w:after="60"/>
+                    <w:jc w:val="right"/>
+                  </w:pPr>
+                  <w:r/>
+                  <w:r>
+                    <w:rPr>
+                      <w:rFonts w:ascii="Calibri" w:hAnsi="Calibri"/>
+                      <w:color w:val="6D28D9"/>
+                      <w:sz w:val="17"/>
+                    </w:rPr>
+                    <w:t>~18 млн</w:t>
+                  </w:r>
+                </w:p>
+              </w:tc>
+              <w:tc>
+                <w:tcPr>
+                  <w:tcW w:type="dxa" w:w="1020"/>
+                  <w:shd w:fill="f5f3ff" w:val="clear"/>
+                </w:tcPr>
+                <w:p>
+                  <w:pPr>
+                    <w:spacing w:before="60" w:after="60"/>
+                    <w:jc w:val="right"/>
+                  </w:pPr>
+                  <w:r/>
+                  <w:r>
+                    <w:rPr>
+                      <w:rFonts w:ascii="Calibri" w:hAnsi="Calibri"/>
+                      <w:color w:val="6D28D9"/>
+                      <w:sz w:val="17"/>
+                    </w:rPr>
+                    <w:t>~18,8 млн</w:t>
+                  </w:r>
+                </w:p>
+              </w:tc>
+              <w:tc>
+                <w:tcPr>
+                  <w:tcW w:type="dxa" w:w="1417"/>
+                  <w:shd w:fill="f5f3ff" w:val="clear"/>
+                </w:tcPr>
+                <w:p>
+                  <w:pPr>
+                    <w:spacing w:before="60" w:after="60"/>
+                    <w:jc w:val="right"/>
+                  </w:pPr>
+                  <w:r/>
+                  <w:r>
+                    <w:rPr>
+                      <w:rFonts w:ascii="Calibri" w:hAnsi="Calibri"/>
+                      <w:b/>
+                      <w:color w:val="6D28D9"/>
+                      <w:sz w:val="17"/>
+                    </w:rPr>
+                    <w:t>~63,8 млн</w:t>
+                  </w:r>
+                </w:p>
+              </w:tc>
+            </w:tr>
+            <w:tr>
+              <w:tc>
+                <w:tcPr>
+                  <w:tcW w:type="dxa" w:w="2381"/>
+                  <w:shd w:fill="f9fafb" w:val="clear"/>
+                </w:tcPr>
+                <w:p>
+                  <w:pPr>
+                    <w:spacing w:before="60" w:after="60"/>
+                  </w:pPr>
+                  <w:r/>
+                  <w:r>
+                    <w:rPr>
+                      <w:rFonts w:ascii="Calibri" w:hAnsi="Calibri"/>
+                      <w:color w:val="D97706"/>
+                      <w:sz w:val="17"/>
+                    </w:rPr>
+                    <w:t>Экономия: налог на имущество (0%)</w:t>
+                  </w:r>
+                </w:p>
+              </w:tc>
+              <w:tc>
+                <w:tcPr>
+                  <w:tcW w:type="dxa" w:w="1020"/>
+                  <w:shd w:fill="fffbeb" w:val="clear"/>
+                </w:tcPr>
+                <w:p>
+                  <w:pPr>
+                    <w:spacing w:before="60" w:after="60"/>
+                    <w:jc w:val="right"/>
+                  </w:pPr>
+                  <w:r/>
+                  <w:r>
+                    <w:rPr>
+                      <w:rFonts w:ascii="Calibri" w:hAnsi="Calibri"/>
+                      <w:color w:val="D97706"/>
+                      <w:sz w:val="17"/>
+                    </w:rPr>
+                    <w:t>~1,3 млн</w:t>
+                  </w:r>
+                </w:p>
+              </w:tc>
+              <w:tc>
+                <w:tcPr>
+                  <w:tcW w:type="dxa" w:w="1020"/>
+                  <w:shd w:fill="fffbeb" w:val="clear"/>
+                </w:tcPr>
+                <w:p>
+                  <w:pPr>
+                    <w:spacing w:before="60" w:after="60"/>
+                    <w:jc w:val="right"/>
+                  </w:pPr>
+                  <w:r/>
+                  <w:r>
+                    <w:rPr>
+                      <w:rFonts w:ascii="Calibri" w:hAnsi="Calibri"/>
+                      <w:color w:val="D97706"/>
+                      <w:sz w:val="17"/>
+                    </w:rPr>
+                    <w:t>~2,0 млн</w:t>
+                  </w:r>
+                </w:p>
+              </w:tc>
+              <w:tc>
+                <w:tcPr>
+                  <w:tcW w:type="dxa" w:w="1020"/>
+                  <w:shd w:fill="fffbeb" w:val="clear"/>
+                </w:tcPr>
+                <w:p>
+                  <w:pPr>
+                    <w:spacing w:before="60" w:after="60"/>
+                    <w:jc w:val="right"/>
+                  </w:pPr>
+                  <w:r/>
+                  <w:r>
+                    <w:rPr>
+                      <w:rFonts w:ascii="Calibri" w:hAnsi="Calibri"/>
+                      <w:color w:val="D97706"/>
+                      <w:sz w:val="17"/>
+                    </w:rPr>
+                    <w:t>~3,5 млн</w:t>
+                  </w:r>
+                </w:p>
+              </w:tc>
+              <w:tc>
+                <w:tcPr>
+                  <w:tcW w:type="dxa" w:w="1020"/>
+                  <w:shd w:fill="fffbeb" w:val="clear"/>
+                </w:tcPr>
+                <w:p>
+                  <w:pPr>
+                    <w:spacing w:before="60" w:after="60"/>
+                    <w:jc w:val="right"/>
+                  </w:pPr>
+                  <w:r/>
+                  <w:r>
+                    <w:rPr>
+                      <w:rFonts w:ascii="Calibri" w:hAnsi="Calibri"/>
+                      <w:color w:val="D97706"/>
+                      <w:sz w:val="17"/>
+                    </w:rPr>
+                    <w:t>~2,8 млн</w:t>
+                  </w:r>
+                </w:p>
+              </w:tc>
+              <w:tc>
+                <w:tcPr>
+                  <w:tcW w:type="dxa" w:w="1417"/>
+                  <w:shd w:fill="fffbeb" w:val="clear"/>
+                </w:tcPr>
+                <w:p>
+                  <w:pPr>
+                    <w:spacing w:before="60" w:after="60"/>
+                    <w:jc w:val="right"/>
+                  </w:pPr>
+                  <w:r/>
+                  <w:r>
+                    <w:rPr>
+                      <w:rFonts w:ascii="Calibri" w:hAnsi="Calibri"/>
+                      <w:b/>
+                      <w:color w:val="D97706"/>
+                      <w:sz w:val="17"/>
+                    </w:rPr>
+                    <w:t>~9,6 млн</w:t>
+                  </w:r>
+                </w:p>
+              </w:tc>
+            </w:tr>
+          </w:tbl>
+          <w:p/>
+          <w:tbl>
+            <w:tblPr>
+              <w:tblBorders>
+                <w:top w:val="single" w:sz="8" w:space="0" w:color="fecaca"/>
+                <w:bottom w:val="single" w:sz="8" w:space="0" w:color="fecaca"/>
+                <w:left w:val="single" w:sz="8" w:space="0" w:color="fecaca"/>
+                <w:right w:val="single" w:sz="8" w:space="0" w:color="fecaca"/>
+              </w:tblBorders>
+            </w:tblPr>
+            <w:tblGrid>
+              <w:gridCol w:w="9071"/>
+            </w:tblGrid>
+            <w:tr>
+              <w:tc>
+                <w:tcPr>
+                  <w:tcW w:type="dxa" w:w="8787"/>
+                  <w:shd w:fill="fef2f2" w:val="clear"/>
+                </w:tcPr>
+                <w:p>
+                  <w:pPr>
+                    <w:spacing w:before="120" w:after="120"/>
+                  </w:pPr>
+                  <w:r/>
+                  <w:r>
+                    <w:rPr>
+                      <w:rFonts w:ascii="Calibri" w:hAnsi="Calibri"/>
+                      <w:b/>
+                      <w:color w:val="DC2626"/>
+                      <w:sz w:val="24"/>
+                    </w:rPr>
+                    <w:t>🔥 ИТОГО ЭКОНОМИЯ ЗА 4 ГОДА: ~134,7 млн ₽</w:t>
+                    <w:br/>
+                    <w:t>Если бы мы уже были резидентом Сколково</w:t>
+                  </w:r>
+                </w:p>
+              </w:tc>
+            </w:tr>
+          </w:tbl>
+          <w:p/>
+          <w:tbl>
+            <w:tblPr>
+              <w:tblBorders>
+                <w:top w:val="single" w:sz="8" w:space="0" w:color="fdba74"/>
+                <w:bottom w:val="single" w:sz="8" w:space="0" w:color="fdba74"/>
+                <w:left w:val="single" w:sz="8" w:space="0" w:color="fdba74"/>
+                <w:right w:val="single" w:sz="8" w:space="0" w:color="fdba74"/>
+              </w:tblBorders>
+            </w:tblPr>
+            <w:tblGrid>
+              <w:gridCol w:w="9071"/>
+            </w:tblGrid>
+            <w:tr>
+              <w:tc>
+                <w:tcPr>
+                  <w:tcW w:type="dxa" w:w="8787"/>
+                  <w:shd w:fill="fff7ed" w:val="clear"/>
+                </w:tcPr>
+                <w:p>
+                  <w:pPr>
+                    <w:spacing w:before="120" w:after="120"/>
+                  </w:pPr>
+                  <w:r/>
+                  <w:r>
+                    <w:rPr>
+                      <w:rFonts w:ascii="Calibri" w:hAnsi="Calibri"/>
+                      <w:b/>
+                      <w:color w:val="C2410C"/>
+                      <w:sz w:val="24"/>
+                    </w:rPr>
+                    <w:t>🔮 ПРОГНОЗ НА 10 ЛЕТ: от 335 до 435 млн ₽</w:t>
+                    <w:br/>
+                    <w:t>или ~34–44 млн ₽/год</w:t>
+                  </w:r>
+                </w:p>
+              </w:tc>
+            </w:tr>
+          </w:tbl>
+          <w:p/>
+          <w:tbl>
+            <w:tblPr>
+              <w:tblBorders>
+                <w:top w:val="single" w:sz="8" w:space="0" w:color="fca5a5"/>
+                <w:bottom w:val="single" w:sz="8" w:space="0" w:color="fca5a5"/>
+                <w:left w:val="single" w:sz="8" w:space="0" w:color="fca5a5"/>
+                <w:right w:val="single" w:sz="8" w:space="0" w:color="fca5a5"/>
+              </w:tblBorders>
+            </w:tblPr>
+            <w:tblGrid>
+              <w:gridCol w:w="9071"/>
+            </w:tblGrid>
+            <w:tr>
+              <w:tc>
+                <w:tcPr>
+                  <w:tcW w:type="dxa" w:w="8787"/>
+                  <w:shd w:fill="fef2f2" w:val="clear"/>
+                </w:tcPr>
+                <w:p>
+                  <w:pPr>
+                    <w:spacing w:before="120" w:after="120"/>
+                  </w:pPr>
+                  <w:r/>
+                  <w:r>
+                    <w:rPr>
+                      <w:rFonts w:ascii="Calibri" w:hAnsi="Calibri"/>
+                      <w:b/>
+                      <w:color w:val="991B1B"/>
+                      <w:sz w:val="20"/>
+                    </w:rPr>
+                    <w:t>⚡ Каждый год промедления = ~34–44 млн ₽ упущенной экономии.</w:t>
+                  </w:r>
+                </w:p>
+              </w:tc>
+            </w:tr>
+          </w:tbl>
+          <w:p/>
         </w:tc>
       </w:tr>
     </w:tbl>
+    <w:p>
+      <w:pPr>
+        <w:spacing w:before="60" w:after="0"/>
+      </w:pPr>
+    </w:p>
     <w:tbl>
       <w:tblPr>
-        <w:tblW w:type="auto" w:w="0"/>
-        <w:tblLook w:firstColumn="1" w:firstRow="1" w:lastColumn="0" w:lastRow="0" w:noHBand="0" w:noVBand="1" w:val="04A0"/>
+        <w:tblBorders>
+          <w:top w:val="single" w:sz="6" w:space="0" w:color="e5e7eb"/>
+          <w:bottom w:val="single" w:sz="6" w:space="0" w:color="e5e7eb"/>
+          <w:left w:val="single" w:sz="6" w:space="0" w:color="e5e7eb"/>
+          <w:right w:val="single" w:sz="6" w:space="0" w:color="e5e7eb"/>
+        </w:tblBorders>
       </w:tblPr>
       <w:tblGrid>
-        <w:gridCol w:w="9406"/>
+        <w:gridCol w:w="9972"/>
       </w:tblGrid>
       <w:tr>
         <w:tc>
           <w:tcPr>
-            <w:tcW w:type="dxa" w:w="9406"/>
+            <w:tcW w:type="dxa" w:w="9071"/>
+            <w:shd w:fill="f3f4f6" w:val="clear"/>
           </w:tcPr>
           <w:p>
+            <w:pPr>
+              <w:spacing w:before="140" w:after="140"/>
+            </w:pPr>
+            <w:r/>
             <w:r>
               <w:rPr>
+                <w:rFonts w:ascii="Calibri" w:hAnsi="Calibri"/>
                 <w:b/>
-                <w:sz w:val="22"/>
+                <w:color w:val="111827"/>
+                <w:sz w:val="20"/>
               </w:rPr>
               <w:t>4️⃣ Интеллектуальная собственность</w:t>
             </w:r>
@@ -353,40 +1770,170 @@
       <w:tr>
         <w:tc>
           <w:tcPr>
-            <w:tcW w:type="dxa" w:w="9406"/>
+            <w:tcW w:type="dxa" w:w="9071"/>
           </w:tcPr>
           <w:p>
             <w:r>
-              <w:t>Действующие патенты не обнаружены в открытых источниках.</w:t>
+              <w:br/>
+              <w:t>Действующие патенты не обнаружены.</w:t>
               <w:br/>
               <w:br/>
-              <w:t>Рекомендуется подача заявки на полезную модель по тематике: технологию производства металлоконструкций с повышенной прочностью и коррозионной стойкостью.</w:t>
+              <w:t>Рекомендуется подача заявки на полезную модель по тематике:</w:t>
+              <w:br/>
+              <w:t>технологию производства металлоконструкций с повышенной прочностью и коррозионной стойкостью</w:t>
               <w:br/>
               <w:br/>
-              <w:t>Подача патента осуществляется параллельно с заявкой в Сколково (срок получения патента: 4–5 месяцев).</w:t>
+              <w:t>Подача параллельно с заявкой в Сколково (срок получения: 4–5 месяцев).</w:t>
             </w:r>
           </w:p>
+          <w:tbl>
+            <w:tblPr>
+              <w:tblBorders>
+                <w:top w:val="single" w:sz="8" w:space="0" w:color="fca5a5"/>
+                <w:bottom w:val="single" w:sz="8" w:space="0" w:color="fca5a5"/>
+                <w:left w:val="single" w:sz="8" w:space="0" w:color="fca5a5"/>
+                <w:right w:val="single" w:sz="8" w:space="0" w:color="fca5a5"/>
+              </w:tblBorders>
+            </w:tblPr>
+            <w:tblGrid>
+              <w:gridCol w:w="9071"/>
+            </w:tblGrid>
+            <w:tr>
+              <w:tc>
+                <w:tcPr>
+                  <w:tcW w:type="dxa" w:w="8787"/>
+                  <w:shd w:fill="fee2e2" w:val="clear"/>
+                </w:tcPr>
+                <w:p>
+                  <w:pPr>
+                    <w:spacing w:before="120" w:after="120"/>
+                  </w:pPr>
+                  <w:r/>
+                  <w:r>
+                    <w:rPr>
+                      <w:rFonts w:ascii="Calibri" w:hAnsi="Calibri"/>
+                      <w:b/>
+                      <w:color w:val="991B1B"/>
+                      <w:sz w:val="19"/>
+                    </w:rPr>
+                    <w:t>✗ Зарегистрированные патенты и заявки — Не найдены</w:t>
+                  </w:r>
+                </w:p>
+              </w:tc>
+            </w:tr>
+          </w:tbl>
+          <w:p/>
+          <w:tbl>
+            <w:tblPr>
+              <w:tblBorders>
+                <w:top w:val="single" w:sz="8" w:space="0" w:color="86efac"/>
+                <w:bottom w:val="single" w:sz="8" w:space="0" w:color="86efac"/>
+                <w:left w:val="single" w:sz="8" w:space="0" w:color="86efac"/>
+                <w:right w:val="single" w:sz="8" w:space="0" w:color="86efac"/>
+              </w:tblBorders>
+            </w:tblPr>
+            <w:tblGrid>
+              <w:gridCol w:w="9071"/>
+            </w:tblGrid>
+            <w:tr>
+              <w:tc>
+                <w:tcPr>
+                  <w:tcW w:type="dxa" w:w="8787"/>
+                  <w:shd w:fill="dcfce7" w:val="clear"/>
+                </w:tcPr>
+                <w:p>
+                  <w:pPr>
+                    <w:spacing w:before="120" w:after="120"/>
+                  </w:pPr>
+                  <w:r/>
+                  <w:r>
+                    <w:rPr>
+                      <w:rFonts w:ascii="Calibri" w:hAnsi="Calibri"/>
+                      <w:b/>
+                      <w:color w:val="166534"/>
+                      <w:sz w:val="19"/>
+                    </w:rPr>
+                    <w:t>✓ Конструкторский отдел (ноу-хау) — Подтверждён</w:t>
+                  </w:r>
+                </w:p>
+              </w:tc>
+            </w:tr>
+          </w:tbl>
+          <w:p/>
+          <w:tbl>
+            <w:tblPr>
+              <w:tblBorders>
+                <w:top w:val="single" w:sz="8" w:space="0" w:color="93c5fd"/>
+                <w:bottom w:val="single" w:sz="8" w:space="0" w:color="93c5fd"/>
+                <w:left w:val="single" w:sz="8" w:space="0" w:color="93c5fd"/>
+                <w:right w:val="single" w:sz="8" w:space="0" w:color="93c5fd"/>
+              </w:tblBorders>
+            </w:tblPr>
+            <w:tblGrid>
+              <w:gridCol w:w="9071"/>
+            </w:tblGrid>
+            <w:tr>
+              <w:tc>
+                <w:tcPr>
+                  <w:tcW w:type="dxa" w:w="8787"/>
+                  <w:shd w:fill="eff6ff" w:val="clear"/>
+                </w:tcPr>
+                <w:p>
+                  <w:pPr>
+                    <w:spacing w:before="120" w:after="120"/>
+                  </w:pPr>
+                  <w:r/>
+                  <w:r>
+                    <w:rPr>
+                      <w:rFonts w:ascii="Calibri" w:hAnsi="Calibri"/>
+                      <w:b/>
+                      <w:color w:val="1E40AF"/>
+                      <w:sz w:val="19"/>
+                    </w:rPr>
+                    <w:t>💡 Что нужно для заявки: минимум 1 патент или заявка на полезную модель. Мы можем подать заявку на патент параллельно с заявкой в Сколково (4–5 мес., ~90 тыс. ₽).</w:t>
+                  </w:r>
+                </w:p>
+              </w:tc>
+            </w:tr>
+          </w:tbl>
+          <w:p/>
         </w:tc>
       </w:tr>
     </w:tbl>
+    <w:p>
+      <w:pPr>
+        <w:spacing w:before="60" w:after="0"/>
+      </w:pPr>
+    </w:p>
     <w:tbl>
       <w:tblPr>
-        <w:tblW w:type="auto" w:w="0"/>
-        <w:tblLook w:firstColumn="1" w:firstRow="1" w:lastColumn="0" w:lastRow="0" w:noHBand="0" w:noVBand="1" w:val="04A0"/>
+        <w:tblBorders>
+          <w:top w:val="single" w:sz="6" w:space="0" w:color="e5e7eb"/>
+          <w:bottom w:val="single" w:sz="6" w:space="0" w:color="e5e7eb"/>
+          <w:left w:val="single" w:sz="6" w:space="0" w:color="e5e7eb"/>
+          <w:right w:val="single" w:sz="6" w:space="0" w:color="e5e7eb"/>
+        </w:tblBorders>
       </w:tblPr>
       <w:tblGrid>
-        <w:gridCol w:w="9406"/>
+        <w:gridCol w:w="9972"/>
       </w:tblGrid>
       <w:tr>
         <w:tc>
           <w:tcPr>
-            <w:tcW w:type="dxa" w:w="9406"/>
+            <w:tcW w:type="dxa" w:w="9071"/>
+            <w:shd w:fill="f3f4f6" w:val="clear"/>
           </w:tcPr>
           <w:p>
+            <w:pPr>
+              <w:spacing w:before="140" w:after="140"/>
+            </w:pPr>
+            <w:r/>
             <w:r>
               <w:rPr>
+                <w:rFonts w:ascii="Calibri" w:hAnsi="Calibri"/>
                 <w:b/>
-                <w:sz w:val="22"/>
+                <w:color w:val="111827"/>
+                <w:sz w:val="20"/>
               </w:rPr>
               <w:t>5️⃣ Связанные компании</w:t>
             </w:r>
@@ -396,34 +1943,145 @@
       <w:tr>
         <w:tc>
           <w:tcPr>
-            <w:tcW w:type="dxa" w:w="9406"/>
+            <w:tcW w:type="dxa" w:w="9071"/>
           </w:tcPr>
           <w:p>
             <w:r>
-              <w:t>Не обнаружены (или уточняется).</w:t>
+              <w:br/>
+              <w:t>Не обнаружены / уточняется при собеседовании.</w:t>
             </w:r>
           </w:p>
+          <w:p>
+            <w:pPr>
+              <w:spacing w:after="60" w:before="0"/>
+            </w:pPr>
+            <w:r>
+              <w:rPr>
+                <w:rFonts w:ascii="Calibri" w:hAnsi="Calibri"/>
+                <w:color w:val="374151"/>
+                <w:sz w:val="19"/>
+              </w:rPr>
+            </w:r>
+          </w:p>
+          <w:tbl>
+            <w:tblPr>
+              <w:tblBorders>
+                <w:top w:val="single" w:sz="8" w:space="0" w:color="e5e7eb"/>
+                <w:bottom w:val="single" w:sz="8" w:space="0" w:color="e5e7eb"/>
+                <w:left w:val="single" w:sz="8" w:space="0" w:color="e5e7eb"/>
+                <w:right w:val="single" w:sz="8" w:space="0" w:color="e5e7eb"/>
+              </w:tblBorders>
+            </w:tblPr>
+            <w:tblGrid>
+              <w:gridCol w:w="9071"/>
+            </w:tblGrid>
+            <w:tr>
+              <w:tc>
+                <w:tcPr>
+                  <w:tcW w:type="dxa" w:w="8787"/>
+                  <w:shd w:fill="f9fafb" w:val="clear"/>
+                </w:tcPr>
+                <w:p>
+                  <w:pPr>
+                    <w:spacing w:before="120" w:after="120"/>
+                  </w:pPr>
+                  <w:r/>
+                  <w:r>
+                    <w:rPr>
+                      <w:rFonts w:ascii="Calibri" w:hAnsi="Calibri"/>
+                      <w:b/>
+                      <w:color w:val="6B7280"/>
+                      <w:sz w:val="19"/>
+                    </w:rPr>
+                    <w:t>ООО НПК «ТРАНСМАШ» (ИНН 2703092545)</w:t>
+                    <w:br/>
+                    <w:t>50% учредитель — Ершова Е.А.</w:t>
+                    <w:br/>
+                    <w:t>ОКВЭД 46.69 — оптовая торговля ❌</w:t>
+                    <w:br/>
+                    <w:t>Выручка: 0 ₽ · 1 сотрудник</w:t>
+                    <w:br/>
+                    <w:t>Торговый ОКВЭД — не подходит для Сколково.</w:t>
+                  </w:r>
+                </w:p>
+              </w:tc>
+            </w:tr>
+          </w:tbl>
+          <w:p/>
+          <w:tbl>
+            <w:tblPr>
+              <w:tblBorders>
+                <w:top w:val="single" w:sz="8" w:space="0" w:color="93c5fd"/>
+                <w:bottom w:val="single" w:sz="8" w:space="0" w:color="93c5fd"/>
+                <w:left w:val="single" w:sz="8" w:space="0" w:color="93c5fd"/>
+                <w:right w:val="single" w:sz="8" w:space="0" w:color="93c5fd"/>
+              </w:tblBorders>
+            </w:tblPr>
+            <w:tblGrid>
+              <w:gridCol w:w="9071"/>
+            </w:tblGrid>
+            <w:tr>
+              <w:tc>
+                <w:tcPr>
+                  <w:tcW w:type="dxa" w:w="8787"/>
+                  <w:shd w:fill="eff6ff" w:val="clear"/>
+                </w:tcPr>
+                <w:p>
+                  <w:pPr>
+                    <w:spacing w:before="120" w:after="120"/>
+                  </w:pPr>
+                  <w:r/>
+                  <w:r>
+                    <w:rPr>
+                      <w:rFonts w:ascii="Calibri" w:hAnsi="Calibri"/>
+                      <w:b/>
+                      <w:color w:val="1E40AF"/>
+                      <w:sz w:val="18"/>
+                    </w:rPr>
+                    <w:t>⚡ Критерий для справки: Для Сколково подходят компании с основным ОКВЭД из сфер производства, IT или НИОКР. Торговля — не подходит.</w:t>
+                  </w:r>
+                </w:p>
+              </w:tc>
+            </w:tr>
+          </w:tbl>
+          <w:p/>
         </w:tc>
       </w:tr>
     </w:tbl>
+    <w:p>
+      <w:pPr>
+        <w:spacing w:before="60" w:after="0"/>
+      </w:pPr>
+    </w:p>
     <w:tbl>
       <w:tblPr>
-        <w:tblW w:type="auto" w:w="0"/>
-        <w:tblLook w:firstColumn="1" w:firstRow="1" w:lastColumn="0" w:lastRow="0" w:noHBand="0" w:noVBand="1" w:val="04A0"/>
+        <w:tblBorders>
+          <w:top w:val="single" w:sz="6" w:space="0" w:color="c4b5fd"/>
+          <w:bottom w:val="single" w:sz="6" w:space="0" w:color="c4b5fd"/>
+          <w:left w:val="single" w:sz="6" w:space="0" w:color="c4b5fd"/>
+          <w:right w:val="single" w:sz="6" w:space="0" w:color="c4b5fd"/>
+        </w:tblBorders>
       </w:tblPr>
       <w:tblGrid>
-        <w:gridCol w:w="9406"/>
+        <w:gridCol w:w="9972"/>
       </w:tblGrid>
       <w:tr>
         <w:tc>
           <w:tcPr>
-            <w:tcW w:type="dxa" w:w="9406"/>
+            <w:tcW w:type="dxa" w:w="9071"/>
+            <w:shd w:fill="eef2ff" w:val="clear"/>
           </w:tcPr>
           <w:p>
+            <w:pPr>
+              <w:spacing w:before="140" w:after="140"/>
+            </w:pPr>
+            <w:r/>
             <w:r>
               <w:rPr>
+                <w:rFonts w:ascii="Calibri" w:hAnsi="Calibri"/>
                 <w:b/>
-                <w:sz w:val="22"/>
+                <w:color w:val="4C1D95"/>
+                <w:sz w:val="20"/>
               </w:rPr>
               <w:t>🎯 План действий</w:t>
             </w:r>
@@ -433,31 +2091,130 @@
       <w:tr>
         <w:tc>
           <w:tcPr>
-            <w:tcW w:type="dxa" w:w="9406"/>
+            <w:tcW w:type="dxa" w:w="9071"/>
           </w:tcPr>
           <w:p>
             <w:r>
+              <w:br/>
               <w:t>1. Согласовать продукт-инновацию</w:t>
               <w:br/>
-              <w:t xml:space="preserve">   Определить, какой именно продукт/технология соответствуют критериям Сколково. Гипотеза: технологию производства металлоконструкций с повышенной прочностью и коррозионной стойкостью.</w:t>
+              <w:t xml:space="preserve">   Определить, какой продукт/технология соответствуют критериям Сколково.</w:t>
               <w:br/>
               <w:br/>
               <w:t>2. Собрать базовые документы</w:t>
               <w:br/>
-              <w:t xml:space="preserve">   Учредительные документы, штатное расписание, документы сотрудников (дипломы).</w:t>
+              <w:t xml:space="preserve">   Учредительные документы, штатное расписание, дипломы сотрудников.</w:t>
               <w:br/>
               <w:br/>
               <w:t>3. Подать заявку на патент</w:t>
               <w:br/>
-              <w:t xml:space="preserve">   Полезная модель по тематике металлообработки.</w:t>
+              <w:t xml:space="preserve">   Полезная модель: технологию производства металлоконструкций с повышенной прочностью и коррозионной стойкостью</w:t>
               <w:br/>
               <w:br/>
               <w:t>4. Сформировать заявку в Сколково</w:t>
               <w:br/>
-              <w:t xml:space="preserve">   Используя собранные данные и подготовленные документы.</w:t>
               <w:br/>
-              <w:br/>
-              <w:t>5. Подать заявку на МТК (после получения статуса Сколково)</w:t>
+              <w:t>5. Подать заявку на МТК (после Сколково)</w:t>
+            </w:r>
+          </w:p>
+          <w:p>
+            <w:pPr>
+              <w:spacing w:after="0" w:before="80"/>
+            </w:pPr>
+            <w:r>
+              <w:rPr>
+                <w:rFonts w:ascii="Calibri" w:hAnsi="Calibri"/>
+                <w:b/>
+                <w:color w:val="4338CA"/>
+                <w:sz w:val="20"/>
+              </w:rPr>
+            </w:r>
+          </w:p>
+          <w:p>
+            <w:pPr>
+              <w:spacing w:after="40" w:before="0"/>
+            </w:pPr>
+            <w:r>
+              <w:rPr>
+                <w:rFonts w:ascii="Calibri" w:hAnsi="Calibri"/>
+                <w:color w:val="6B7280"/>
+                <w:sz w:val="18"/>
+              </w:rPr>
+            </w:r>
+          </w:p>
+          <w:p>
+            <w:pPr>
+              <w:spacing w:after="0" w:before="80"/>
+            </w:pPr>
+            <w:r>
+              <w:rPr>
+                <w:rFonts w:ascii="Calibri" w:hAnsi="Calibri"/>
+                <w:b/>
+                <w:color w:val="4338CA"/>
+                <w:sz w:val="20"/>
+              </w:rPr>
+            </w:r>
+          </w:p>
+          <w:p>
+            <w:pPr>
+              <w:spacing w:after="40" w:before="0"/>
+            </w:pPr>
+            <w:r>
+              <w:rPr>
+                <w:rFonts w:ascii="Calibri" w:hAnsi="Calibri"/>
+                <w:color w:val="6B7280"/>
+                <w:sz w:val="18"/>
+              </w:rPr>
+            </w:r>
+          </w:p>
+          <w:p>
+            <w:pPr>
+              <w:spacing w:after="0" w:before="80"/>
+            </w:pPr>
+            <w:r>
+              <w:rPr>
+                <w:rFonts w:ascii="Calibri" w:hAnsi="Calibri"/>
+                <w:b/>
+                <w:color w:val="4338CA"/>
+                <w:sz w:val="20"/>
+              </w:rPr>
+            </w:r>
+          </w:p>
+          <w:p>
+            <w:pPr>
+              <w:spacing w:after="40" w:before="0"/>
+            </w:pPr>
+            <w:r>
+              <w:rPr>
+                <w:rFonts w:ascii="Calibri" w:hAnsi="Calibri"/>
+                <w:color w:val="6B7280"/>
+                <w:sz w:val="18"/>
+              </w:rPr>
+            </w:r>
+          </w:p>
+          <w:p>
+            <w:pPr>
+              <w:spacing w:after="0" w:before="80"/>
+            </w:pPr>
+            <w:r>
+              <w:rPr>
+                <w:rFonts w:ascii="Calibri" w:hAnsi="Calibri"/>
+                <w:b/>
+                <w:color w:val="4338CA"/>
+                <w:sz w:val="20"/>
+              </w:rPr>
+            </w:r>
+          </w:p>
+          <w:p>
+            <w:pPr>
+              <w:spacing w:after="40" w:before="0"/>
+            </w:pPr>
+            <w:r>
+              <w:rPr>
+                <w:rFonts w:ascii="Calibri" w:hAnsi="Calibri"/>
+                <w:color w:val="6B7280"/>
+                <w:sz w:val="18"/>
+              </w:rPr>
             </w:r>
           </w:p>
         </w:tc>
@@ -465,31 +2222,26 @@
     </w:tbl>
     <w:p>
       <w:pPr>
+        <w:spacing w:before="60" w:after="0"/>
+      </w:pPr>
+    </w:p>
+    <w:p>
+      <w:pPr>
+        <w:spacing w:before="120"/>
         <w:jc w:val="center"/>
       </w:pPr>
       <w:r>
         <w:rPr>
-          <w:color w:val="B4B4B4"/>
+          <w:rFonts w:ascii="Calibri" w:hAnsi="Calibri"/>
+          <w:color w:val="9CA3AF"/>
           <w:sz w:val="16"/>
         </w:rPr>
-        <w:t>———————————————————————————————————————————————————————</w:t>
-      </w:r>
-    </w:p>
-    <w:p>
-      <w:pPr>
-        <w:jc w:val="center"/>
-      </w:pPr>
-      <w:r>
-        <w:rPr>
-          <w:color w:val="646464"/>
-          <w:sz w:val="18"/>
-        </w:rPr>
-        <w:t>Источники: audit-it.ru, saby.ru · 09.07.2026</w:t>
+        <w:t>Источники: audit-it.ru, testfirm.ru, zachestnyibiznes.ru, rusprofile.ru, list-org.com · 09.07.2026</w:t>
       </w:r>
     </w:p>
     <w:sectPr>
       <w:pgSz w:w="12240" w:h="15840"/>
-      <w:pgMar w:top="1134" w:right="1417" w:bottom="1134" w:left="1417" w:header="720" w:footer="720" w:gutter="0"/>
+      <w:pgMar w:top="850" w:right="1134" w:bottom="850" w:left="1134" w:header="720" w:footer="720" w:gutter="0"/>
       <w:cols w:space="720"/>
       <w:docGrid w:linePitch="360"/>
     </w:sectPr>
@@ -861,7 +2613,7 @@
     <w:qFormat/>
     <w:rsid w:val="00FC693F"/>
     <w:rPr>
-      <w:rFonts w:ascii="Arial" w:hAnsi="Arial"/>
+      <w:rFonts w:ascii="Calibri" w:hAnsi="Calibri"/>
       <w:sz w:val="20"/>
     </w:rPr>
   </w:style>

</xml_diff>